<commit_message>
State of Art 2nd step
Analyse de nouveaux articles issu de ma recherche bibliographique.
</commit_message>
<xml_diff>
--- a/docs/StateOfArt.docx
+++ b/docs/StateOfArt.docx
@@ -3969,13 +3969,7 @@
         <w:rPr>
           <w:lang w:eastAsia="fr-BE"/>
         </w:rPr>
-        <w:t>Anxiété de performance musicale (APM)</w:t>
-      </w:r>
-      <w:r>
-        <w:rPr>
-          <w:lang w:eastAsia="fr-BE"/>
-        </w:rPr>
-        <w:t xml:space="preserve"> </w:t>
+        <w:t xml:space="preserve">Anxiété de performance musicale (APM) </w:t>
       </w:r>
       <w:r>
         <w:rPr>
@@ -4881,249 +4875,801 @@
         </w:rPr>
         <w:t>Utilisation de signaux EEG</w:t>
       </w:r>
+    </w:p>
+    <w:p>
+      <w:pPr>
+        <w:pStyle w:val="Titre1"/>
+      </w:pPr>
+      <w:r>
+        <w:t>Pertinence :</w:t>
+      </w:r>
+    </w:p>
+    <w:p>
+      <w:pPr>
+        <w:pStyle w:val="Titre1"/>
+      </w:pPr>
+      <w:r>
+        <w:t>Score :</w:t>
+      </w:r>
+    </w:p>
+    <w:p>
+      <w:r>
+        <w:t>0</w:t>
+      </w:r>
+    </w:p>
+    <w:p>
+      <w:pPr>
+        <w:jc w:val="left"/>
+      </w:pPr>
+      <w:r>
+        <w:br w:type="page"/>
+      </w:r>
+    </w:p>
+    <w:p>
+      <w:r>
+        <w:lastRenderedPageBreak/>
+        <w:fldChar w:fldCharType="begin"/>
+      </w:r>
+      <w:r>
+        <w:instrText xml:space="preserve"> ADDIN ZOTERO_ITEM CSL_CITATION {"citationID":"SDnCX0FN","properties":{"formattedCitation":"[17]","plainCitation":"[17]","noteIndex":0},"citationItems":[{"id":28,"uris":["http://zotero.org/users/local/ZDVQpXiA/items/2MPPJDQR"],"itemData":{"id":28,"type":"article-journal","abstract":"A survey of conservatoire students is reported in which information was gathered regarding their awareness and incidence of physical and mental health problems resulting from performing music, as well as places and/or people they would turn to for advice in the event of a future problem. Pain and discomfort relating to posture and excessive practising were reported to be frequent, as was performance anxiety. Students showed a significant inclination to go first to their instrumental teacher for advice about health and psychological problems, before appropriate medical practitioners. These results are discussed in the light of previous research. In addition, a curriculum initiative is described in which a series of seminars have been presented to first-year students at the Royal College of Music with the intention of broadening their awareness of the health issues associated with performing professionally and of the places where they could seek professional help.","container-title":"Psychology of Music","DOI":"10.1177/0305735606067150","ISSN":"0305-7356, 1741-3087","issue":"4","journalAbbreviation":"Psychology of Music","language":"en","license":"https://journals.sagepub.com/page/policies/text-and-data-mining-license","page":"411-430","source":"DOI.org (Crossref)","title":"Awareness and incidence of health problems among conservatoire students","volume":"34","author":[{"family":"Williamon","given":"Aaron"},{"family":"Thompson","given":"Sam"}],"issued":{"date-parts":[["2006",10]]}}}],"schema":"https://github.com/citation-style-language/schema/raw/master/csl-citation.json"} </w:instrText>
+      </w:r>
+      <w:r>
+        <w:fldChar w:fldCharType="separate"/>
+      </w:r>
+      <w:r>
+        <w:rPr>
+          <w:rFonts w:ascii="Calibri" w:hAnsi="Calibri" w:cs="Calibri"/>
+        </w:rPr>
+        <w:t>[17]</w:t>
+      </w:r>
+      <w:r>
+        <w:fldChar w:fldCharType="end"/>
+      </w:r>
+    </w:p>
+    <w:p>
+      <w:pPr>
+        <w:pStyle w:val="Bibliographie"/>
+      </w:pPr>
+      <w:r>
+        <w:t xml:space="preserve">A. </w:t>
+      </w:r>
+      <w:proofErr w:type="spellStart"/>
+      <w:r>
+        <w:t>Williamon</w:t>
+      </w:r>
+      <w:proofErr w:type="spellEnd"/>
+      <w:r>
+        <w:t xml:space="preserve"> et S. Thompson, « </w:t>
+      </w:r>
+      <w:proofErr w:type="spellStart"/>
+      <w:r>
+        <w:t>Awareness</w:t>
+      </w:r>
+      <w:proofErr w:type="spellEnd"/>
+      <w:r>
+        <w:t xml:space="preserve"> and incidence of </w:t>
+      </w:r>
+      <w:proofErr w:type="spellStart"/>
+      <w:r>
+        <w:t>health</w:t>
+      </w:r>
+      <w:proofErr w:type="spellEnd"/>
+      <w:r>
+        <w:t xml:space="preserve"> </w:t>
+      </w:r>
+      <w:proofErr w:type="spellStart"/>
+      <w:r>
+        <w:t>problems</w:t>
+      </w:r>
+      <w:proofErr w:type="spellEnd"/>
+      <w:r>
+        <w:t xml:space="preserve"> </w:t>
+      </w:r>
+      <w:proofErr w:type="spellStart"/>
+      <w:r>
+        <w:t>among</w:t>
+      </w:r>
+      <w:proofErr w:type="spellEnd"/>
+      <w:r>
+        <w:t xml:space="preserve"> conservatoire </w:t>
+      </w:r>
+      <w:proofErr w:type="spellStart"/>
+      <w:r>
+        <w:t>students</w:t>
+      </w:r>
+      <w:proofErr w:type="spellEnd"/>
+      <w:r>
+        <w:t xml:space="preserve"> », </w:t>
+      </w:r>
+      <w:proofErr w:type="spellStart"/>
+      <w:r>
+        <w:rPr>
+          <w:i/>
+          <w:iCs/>
+        </w:rPr>
+        <w:t>Psychol</w:t>
+      </w:r>
+      <w:proofErr w:type="spellEnd"/>
+      <w:r>
+        <w:rPr>
+          <w:i/>
+          <w:iCs/>
+        </w:rPr>
+        <w:t>. Music</w:t>
+      </w:r>
+      <w:r>
+        <w:t>, vol. 34, n</w:t>
+      </w:r>
+      <w:r>
+        <w:rPr>
+          <w:vertAlign w:val="superscript"/>
+        </w:rPr>
+        <w:t>o</w:t>
+      </w:r>
+      <w:r>
+        <w:t xml:space="preserve"> 4, p. 411</w:t>
+      </w:r>
+      <w:r>
+        <w:rPr>
+          <w:rFonts w:ascii="Cambria Math" w:hAnsi="Cambria Math" w:cs="Cambria Math"/>
+        </w:rPr>
+        <w:t>‑</w:t>
+      </w:r>
+      <w:r>
+        <w:t xml:space="preserve">430, oct. 2006, </w:t>
+      </w:r>
+      <w:proofErr w:type="spellStart"/>
+      <w:proofErr w:type="gramStart"/>
+      <w:r>
+        <w:t>doi</w:t>
+      </w:r>
+      <w:proofErr w:type="spellEnd"/>
+      <w:r>
+        <w:t>:</w:t>
+      </w:r>
+      <w:proofErr w:type="gramEnd"/>
+      <w:r>
+        <w:t xml:space="preserve"> 10.1177/0305735606067150.</w:t>
+      </w:r>
+    </w:p>
+    <w:p>
+      <w:pPr>
+        <w:pStyle w:val="Titre1"/>
+      </w:pPr>
+      <w:r>
+        <w:t>Thème :</w:t>
+      </w:r>
+    </w:p>
+    <w:p>
+      <w:pPr>
+        <w:rPr>
+          <w:lang w:eastAsia="fr-BE"/>
+        </w:rPr>
+      </w:pPr>
+      <w:r>
+        <w:rPr>
+          <w:lang w:eastAsia="fr-BE"/>
+        </w:rPr>
+        <w:t xml:space="preserve">Conscience des étudiants vis-à-vis des problèmes de santé liés à la pratique musicale. </w:t>
+      </w:r>
+      <w:r>
+        <w:rPr>
+          <w:b/>
+          <w:lang w:eastAsia="fr-BE"/>
+        </w:rPr>
+        <w:t>(B)</w:t>
+      </w:r>
+    </w:p>
+    <w:p>
+      <w:pPr>
+        <w:pStyle w:val="Titre1"/>
+      </w:pPr>
+      <w:r>
+        <w:t>Résumé :</w:t>
+      </w:r>
+    </w:p>
+    <w:p>
+      <w:pPr>
+        <w:rPr>
+          <w:lang w:eastAsia="fr-BE"/>
+        </w:rPr>
+      </w:pPr>
+      <w:r>
+        <w:rPr>
+          <w:lang w:eastAsia="fr-BE"/>
+        </w:rPr>
+        <w:t>Les problèmes fréquents sont douleurs physiques liées à la posture et à l’anxiété de performance.</w:t>
+      </w:r>
+    </w:p>
+    <w:p>
+      <w:pPr>
+        <w:pStyle w:val="Titre1"/>
+      </w:pPr>
+      <w:r>
+        <w:t>Limitations :</w:t>
+      </w:r>
+    </w:p>
+    <w:p>
+      <w:pPr>
+        <w:rPr>
+          <w:lang w:eastAsia="fr-BE"/>
+        </w:rPr>
+      </w:pPr>
+      <w:r>
+        <w:rPr>
+          <w:lang w:eastAsia="fr-BE"/>
+        </w:rPr>
+        <w:t>Uniquement basée sur des questionnaires</w:t>
+      </w:r>
+    </w:p>
+    <w:p>
+      <w:pPr>
+        <w:pStyle w:val="Titre1"/>
+      </w:pPr>
+      <w:r>
+        <w:t>Pertinence :</w:t>
+      </w:r>
+    </w:p>
+    <w:p>
+      <w:pPr>
+        <w:rPr>
+          <w:lang w:eastAsia="fr-BE"/>
+        </w:rPr>
+      </w:pPr>
+      <w:r>
+        <w:rPr>
+          <w:lang w:eastAsia="fr-BE"/>
+        </w:rPr>
+        <w:t>Souligne le besoin de prévention à la santé physique et mentale dans la formation musicale.</w:t>
+      </w:r>
+    </w:p>
+    <w:p>
+      <w:pPr>
+        <w:pStyle w:val="Titre1"/>
+      </w:pPr>
+      <w:r>
+        <w:t>Score :</w:t>
+      </w:r>
+    </w:p>
+    <w:p>
+      <w:r>
+        <w:t>1</w:t>
+      </w:r>
+    </w:p>
+    <w:p>
+      <w:pPr>
+        <w:jc w:val="left"/>
+      </w:pPr>
+      <w:r>
+        <w:br w:type="page"/>
+      </w:r>
       <w:bookmarkStart w:id="0" w:name="_GoBack"/>
       <w:bookmarkEnd w:id="0"/>
     </w:p>
     <w:p>
-      <w:pPr>
-        <w:pStyle w:val="Titre1"/>
-      </w:pPr>
-      <w:r>
-        <w:t>Pertinence :</w:t>
-      </w:r>
-    </w:p>
-    <w:p>
-      <w:pPr>
-        <w:pStyle w:val="Titre1"/>
-      </w:pPr>
-      <w:r>
-        <w:t>Score :</w:t>
-      </w:r>
-    </w:p>
-    <w:p>
-      <w:r>
-        <w:t>0</w:t>
-      </w:r>
-      <w:r>
-        <w:br w:type="page"/>
-      </w:r>
-    </w:p>
-    <w:p>
-      <w:pPr>
-        <w:pStyle w:val="Bibliographie"/>
-      </w:pPr>
       <w:r>
         <w:lastRenderedPageBreak/>
         <w:fldChar w:fldCharType="begin"/>
       </w:r>
       <w:r>
-        <w:instrText xml:space="preserve"> ADDIN ZOTERO_BIBL {"uncited":[],"omitted":[],"custom":[]} CSL_BIBLIOGRAPHY </w:instrText>
+        <w:instrText xml:space="preserve"> ADDIN ZOTERO_ITEM CSL_CITATION {"citationID":"t00mwco8","properties":{"formattedCitation":"[18]","plainCitation":"[18]","noteIndex":0},"citationItems":[{"id":29,"uris":["http://zotero.org/users/local/ZDVQpXiA/items/BBRYW7DP"],"itemData":{"id":29,"type":"article-journal","abstract":"I commenced my academic exploration of music performance anxiety in a study with opera chorus artists from Opera Australia in 2004. I subsequently postulated a new theory of the aetiology of music performance anxiety and began the development of the\n              Kenny Music Performance Anxiety Inventory\n              (K-MPAI) to assess the hypothesized theoretical constructs underpinning its diverse clinical presentations. I proposed a new definition of music performance anxiety in 2009 and revised the item content of the K-MPAI from 26 to 40 in 2011. Over the ensuing years, many researchers have used the K-MPAI in studies on a wide variety of musicians, including vocalists and instrumentalists, popular and classical musicians, tertiary music students, and professional, solo, orchestral, ensemble, band, and community musicians. To date, the K-MPAI has been reported in more than 400 studies and has been translated into 22 languages. It has been the subject of more than 39 dissertations. In this paper, I examine the research that has used the K-MPAI to assess the theory and to ascertain how well the assessment tool, and its cross-cultural validation have provided evidence for its factorial structure, robustness, and utility. The evidence indicates that the factorial structure remains consistent across cultures and different populations of musicians. It has good discriminative ability and utility for diagnostic purposes. I conclude with some reflections on how the K-MPAI can guide therapeutic interventions and with some thoughts on future directions.","container-title":"Frontiers in Psychology","DOI":"10.3389/fpsyg.2023.1143359","ISSN":"1664-1078","journalAbbreviation":"Front. Psychol.","page":"1143359","source":"DOI.org (Crossref)","title":"The Kenny music performance anxiety inventory (K-MPAI): Scale construction, cross-cultural validation, theoretical underpinnings, and diagnostic and therapeutic utility","title-short":"The Kenny music performance anxiety inventory (K-MPAI)","volume":"14","author":[{"family":"Kenny","given":"Dianna Theadora"}],"issued":{"date-parts":[["2023",5,26]]}}}],"schema":"https://github.com/citation-style-language/schema/raw/master/csl-citation.json"} </w:instrText>
       </w:r>
       <w:r>
         <w:fldChar w:fldCharType="separate"/>
       </w:r>
       <w:r>
-        <w:t>[1]</w:t>
-      </w:r>
-      <w:r>
-        <w:tab/>
-      </w:r>
-      <w:bookmarkStart w:id="1" w:name="_Hlk221900155"/>
-      <w:r>
-        <w:t xml:space="preserve">D. R. McLeod, R. Hoehn-Saric, et R. L. Stefan, « Somatic symptoms of anxiety: Comparison of self-report and physiological measures », </w:t>
+        <w:rPr>
+          <w:rFonts w:ascii="Calibri" w:hAnsi="Calibri" w:cs="Calibri"/>
+        </w:rPr>
+        <w:t>[18]</w:t>
+      </w:r>
+      <w:r>
+        <w:fldChar w:fldCharType="end"/>
+      </w:r>
+      <w:r>
+        <w:br/>
+      </w:r>
+      <w:r>
+        <w:t xml:space="preserve">D. T. Kenny, « The Kenny music performance </w:t>
+      </w:r>
+      <w:proofErr w:type="spellStart"/>
+      <w:r>
+        <w:t>anxiety</w:t>
+      </w:r>
+      <w:proofErr w:type="spellEnd"/>
+      <w:r>
+        <w:t xml:space="preserve"> </w:t>
+      </w:r>
+      <w:proofErr w:type="spellStart"/>
+      <w:r>
+        <w:t>inventory</w:t>
+      </w:r>
+      <w:proofErr w:type="spellEnd"/>
+      <w:r>
+        <w:t xml:space="preserve"> (K-MPAI</w:t>
+      </w:r>
+      <w:proofErr w:type="gramStart"/>
+      <w:r>
+        <w:t>):</w:t>
+      </w:r>
+      <w:proofErr w:type="gramEnd"/>
+      <w:r>
+        <w:t xml:space="preserve"> </w:t>
+      </w:r>
+      <w:proofErr w:type="spellStart"/>
+      <w:r>
+        <w:t>Scale</w:t>
+      </w:r>
+      <w:proofErr w:type="spellEnd"/>
+      <w:r>
+        <w:t xml:space="preserve"> construction, cross-cultural validation, </w:t>
+      </w:r>
+      <w:proofErr w:type="spellStart"/>
+      <w:r>
+        <w:t>theoretical</w:t>
+      </w:r>
+      <w:proofErr w:type="spellEnd"/>
+      <w:r>
+        <w:t xml:space="preserve"> </w:t>
+      </w:r>
+      <w:proofErr w:type="spellStart"/>
+      <w:r>
+        <w:t>underpinnings</w:t>
+      </w:r>
+      <w:proofErr w:type="spellEnd"/>
+      <w:r>
+        <w:t xml:space="preserve">, and diagnostic and </w:t>
+      </w:r>
+      <w:proofErr w:type="spellStart"/>
+      <w:r>
+        <w:t>therapeutic</w:t>
+      </w:r>
+      <w:proofErr w:type="spellEnd"/>
+      <w:r>
+        <w:t xml:space="preserve"> utility », </w:t>
       </w:r>
       <w:r>
         <w:rPr>
           <w:i/>
           <w:iCs/>
         </w:rPr>
-        <w:t>Biol. Psychiatry</w:t>
-      </w:r>
-      <w:r>
-        <w:t>, vol. 21, n</w:t>
-      </w:r>
-      <w:r>
-        <w:rPr>
-          <w:vertAlign w:val="superscript"/>
-        </w:rPr>
-        <w:t>o</w:t>
-      </w:r>
-      <w:r>
-        <w:t xml:space="preserve"> 3, p. 301</w:t>
-      </w:r>
-      <w:r>
-        <w:rPr>
-          <w:rFonts w:ascii="Cambria Math" w:hAnsi="Cambria Math" w:cs="Cambria Math"/>
-        </w:rPr>
-        <w:t>‑</w:t>
-      </w:r>
-      <w:r>
-        <w:t>310, mars 1986, doi: 10.1016/0006-3223(86)90051-X.</w:t>
-      </w:r>
-      <w:bookmarkEnd w:id="1"/>
-    </w:p>
-    <w:p>
-      <w:pPr>
-        <w:pStyle w:val="Bibliographie"/>
-      </w:pPr>
-      <w:r>
-        <w:t>[2]</w:t>
-      </w:r>
-      <w:r>
-        <w:tab/>
-        <w:t xml:space="preserve">A. Williamon, L. Aufegger, D. Wasley, D. Looney, et D. P. Mandic, « Complexity of physiological responses decreases in high-stress musical performance », </w:t>
-      </w:r>
+        <w:t xml:space="preserve">Front. </w:t>
+      </w:r>
+      <w:proofErr w:type="spellStart"/>
       <w:r>
         <w:rPr>
           <w:i/>
           <w:iCs/>
         </w:rPr>
-        <w:t>J. R. Soc. Interface</w:t>
-      </w:r>
-      <w:r>
-        <w:t>, vol. 10, n</w:t>
-      </w:r>
-      <w:r>
-        <w:rPr>
-          <w:vertAlign w:val="superscript"/>
-        </w:rPr>
-        <w:t>o</w:t>
-      </w:r>
-      <w:r>
-        <w:t xml:space="preserve"> 89, p. 20130719, déc. 2013, doi: 10.1098/rsif.2013.0719.</w:t>
-      </w:r>
-    </w:p>
-    <w:p>
-      <w:pPr>
-        <w:pStyle w:val="Bibliographie"/>
-      </w:pPr>
-      <w:r>
-        <w:t>[3]</w:t>
-      </w:r>
-      <w:r>
-        <w:tab/>
-        <w:t xml:space="preserve">D. Ciuk, A. K. Troy, et M. C. Jones, « Measuring Emotion: Self-Reports vs. Physiological Indicators », </w:t>
-      </w:r>
+        <w:t>Psychol</w:t>
+      </w:r>
+      <w:proofErr w:type="spellEnd"/>
       <w:r>
         <w:rPr>
           <w:i/>
           <w:iCs/>
         </w:rPr>
-        <w:t>SSRN Electron. J.</w:t>
-      </w:r>
-      <w:r>
-        <w:t>, 2015, doi: 10.2139/ssrn.2595359.</w:t>
-      </w:r>
-    </w:p>
-    <w:p>
-      <w:pPr>
-        <w:pStyle w:val="Bibliographie"/>
-      </w:pPr>
-      <w:r>
-        <w:t>[4]</w:t>
-      </w:r>
-      <w:r>
-        <w:tab/>
-        <w:t xml:space="preserve">F. Hernando-Gallego et A. Artés-Rodríguez, « Individual performance calibration using physiological stress signals », 2015, </w:t>
+        <w:t>.</w:t>
+      </w:r>
+      <w:r>
+        <w:t xml:space="preserve">, vol. 14, p. 1143359, mai 2023, </w:t>
+      </w:r>
+      <w:proofErr w:type="spellStart"/>
+      <w:proofErr w:type="gramStart"/>
+      <w:r>
+        <w:t>doi</w:t>
+      </w:r>
+      <w:proofErr w:type="spellEnd"/>
+      <w:r>
+        <w:t>:</w:t>
+      </w:r>
+      <w:proofErr w:type="gramEnd"/>
+      <w:r>
+        <w:t xml:space="preserve"> 10.3389/fpsyg.2023.1143359.</w:t>
+      </w:r>
+    </w:p>
+    <w:p>
+      <w:pPr>
+        <w:pStyle w:val="Titre1"/>
+      </w:pPr>
+      <w:r>
+        <w:t>Thème :</w:t>
+      </w:r>
+    </w:p>
+    <w:p>
+      <w:pPr>
+        <w:rPr>
+          <w:lang w:eastAsia="fr-BE"/>
+        </w:rPr>
+      </w:pPr>
+      <w:r>
+        <w:rPr>
+          <w:lang w:eastAsia="fr-BE"/>
+        </w:rPr>
+        <w:t>Construction de l’inventaire K-MPAI</w:t>
+      </w:r>
+      <w:r>
+        <w:rPr>
+          <w:lang w:eastAsia="fr-BE"/>
+        </w:rPr>
+        <w:t xml:space="preserve"> </w:t>
+      </w:r>
+      <w:r>
+        <w:rPr>
+          <w:b/>
+          <w:lang w:eastAsia="fr-BE"/>
+        </w:rPr>
+        <w:t>(</w:t>
+      </w:r>
+      <w:r>
+        <w:rPr>
+          <w:b/>
+          <w:lang w:eastAsia="fr-BE"/>
+        </w:rPr>
+        <w:t>D</w:t>
+      </w:r>
+      <w:r>
+        <w:rPr>
+          <w:b/>
+          <w:lang w:eastAsia="fr-BE"/>
+        </w:rPr>
+        <w:t>)</w:t>
+      </w:r>
+    </w:p>
+    <w:p>
+      <w:pPr>
+        <w:pStyle w:val="Titre1"/>
+      </w:pPr>
+      <w:r>
+        <w:t>Résumé :</w:t>
+      </w:r>
+    </w:p>
+    <w:p>
+      <w:pPr>
+        <w:rPr>
+          <w:lang w:eastAsia="fr-BE"/>
+        </w:rPr>
+      </w:pPr>
+      <w:r>
+        <w:rPr>
+          <w:lang w:eastAsia="fr-BE"/>
+        </w:rPr>
+        <w:t>Revue intégrative des articles utilisant le K-MPAI (questionnaire de 40 items, basé sur une échelle Likert à 7 points, mesurant l’anxiété liée à la performance musicale). Grande cohérence interne et forte convergence avec d’autres échelles et ce dans différentes cultures (application internationale).</w:t>
+      </w:r>
+    </w:p>
+    <w:p>
+      <w:pPr>
+        <w:pStyle w:val="Titre1"/>
+      </w:pPr>
+      <w:r>
+        <w:t>Limitations :</w:t>
+      </w:r>
+    </w:p>
+    <w:p>
+      <w:pPr>
+        <w:pStyle w:val="Titre1"/>
+      </w:pPr>
+      <w:r>
+        <w:t>Pertinence :</w:t>
+      </w:r>
+    </w:p>
+    <w:p>
+      <w:pPr>
+        <w:rPr>
+          <w:lang w:eastAsia="fr-BE"/>
+        </w:rPr>
+      </w:pPr>
+      <w:r>
+        <w:rPr>
+          <w:lang w:eastAsia="fr-BE"/>
+        </w:rPr>
+        <w:t>Confirme l’utilisation de K-MPAI</w:t>
+      </w:r>
+    </w:p>
+    <w:p>
+      <w:pPr>
+        <w:pStyle w:val="Titre1"/>
+      </w:pPr>
+      <w:r>
+        <w:t>Score :</w:t>
+      </w:r>
+    </w:p>
+    <w:p>
+      <w:r>
+        <w:t>3</w:t>
+      </w:r>
+    </w:p>
+    <w:p>
+      <w:pPr>
+        <w:jc w:val="left"/>
+      </w:pPr>
+      <w:r>
+        <w:br w:type="page"/>
+      </w:r>
+    </w:p>
+    <w:p>
+      <w:r>
+        <w:lastRenderedPageBreak/>
+        <w:fldChar w:fldCharType="begin"/>
+      </w:r>
+      <w:r>
+        <w:instrText xml:space="preserve"> ADDIN ZOTERO_ITEM CSL_CITATION {"citationID":"qOeU6kIa","properties":{"formattedCitation":"[19]","plainCitation":"[19]","noteIndex":0},"citationItems":[{"id":31,"uris":["http://zotero.org/users/local/ZDVQpXiA/items/TI7QLN4A"],"itemData":{"id":31,"type":"article-journal","abstract":"Music performance anxiety (MPA) is a widespread challenge among musicians, often impairing performance quality and well-being. While traditionally conceptualized as a debilitating condition, recent research suggests that MPA can have both facilitative and detrimental effects, depending on how it is appraised and regulated. This paper reviews theoretical stress models relevant to MPA, emphasizing frameworks such as stress optimization and synergistic mindsets that help reframe anxiety as a potential resource. By integrating insights from affective science and stress research, this review highlights the need for a more nuanced approach to MPA—one that moves beyond symptom reduction to foster adaptive responses that enhance musical performance. Future research should continue exploring personalized and flexible interventions that equip musicians with the tools to navigate evaluative pressure effectively.","container-title":"Frontiers in Psychology","DOI":"10.3389/fpsyg.2025.1576391","ISSN":"1664-1078","journalAbbreviation":"Front. Psychol.","page":"1576391","source":"DOI.org (Crossref)","title":"A review of music performance anxiety in the lens of stress models","volume":"16","author":[{"family":"Twitchell","given":"A. J."},{"family":"Journault","given":"A-A."},{"family":"Singh","given":"K. K."},{"family":"Jamieson","given":"J. P."}],"issued":{"date-parts":[["2025",4,16]]}}}],"schema":"https://github.com/citation-style-language/schema/raw/master/csl-citation.json"} </w:instrText>
+      </w:r>
+      <w:r>
+        <w:fldChar w:fldCharType="separate"/>
+      </w:r>
+      <w:r>
+        <w:rPr>
+          <w:rFonts w:ascii="Calibri" w:hAnsi="Calibri" w:cs="Calibri"/>
+        </w:rPr>
+        <w:t>[19]</w:t>
+      </w:r>
+      <w:r>
+        <w:fldChar w:fldCharType="end"/>
+      </w:r>
+    </w:p>
+    <w:p>
+      <w:r>
+        <w:t xml:space="preserve">A. J. </w:t>
+      </w:r>
+      <w:proofErr w:type="spellStart"/>
+      <w:r>
+        <w:t>Twitchell</w:t>
+      </w:r>
+      <w:proofErr w:type="spellEnd"/>
+      <w:r>
+        <w:t xml:space="preserve">, A.-A. </w:t>
+      </w:r>
+      <w:proofErr w:type="spellStart"/>
+      <w:r>
+        <w:t>Journault</w:t>
+      </w:r>
+      <w:proofErr w:type="spellEnd"/>
+      <w:r>
+        <w:t xml:space="preserve">, K. K. Singh, et J. P. Jamieson, « A </w:t>
+      </w:r>
+      <w:proofErr w:type="spellStart"/>
+      <w:r>
+        <w:t>review</w:t>
+      </w:r>
+      <w:proofErr w:type="spellEnd"/>
+      <w:r>
+        <w:t xml:space="preserve"> of music performance </w:t>
+      </w:r>
+      <w:proofErr w:type="spellStart"/>
+      <w:r>
+        <w:t>anxiety</w:t>
+      </w:r>
+      <w:proofErr w:type="spellEnd"/>
+      <w:r>
+        <w:t xml:space="preserve"> in the </w:t>
+      </w:r>
+      <w:proofErr w:type="spellStart"/>
+      <w:r>
+        <w:t>lens</w:t>
+      </w:r>
+      <w:proofErr w:type="spellEnd"/>
+      <w:r>
+        <w:t xml:space="preserve"> of stress </w:t>
+      </w:r>
+      <w:proofErr w:type="spellStart"/>
+      <w:r>
+        <w:t>models</w:t>
+      </w:r>
+      <w:proofErr w:type="spellEnd"/>
+      <w:r>
+        <w:t xml:space="preserve"> », </w:t>
       </w:r>
       <w:r>
         <w:rPr>
           <w:i/>
           <w:iCs/>
         </w:rPr>
-        <w:t>arXiv</w:t>
-      </w:r>
-      <w:r>
-        <w:t>. doi: 10.48550/ARXIV.1507.03482.</w:t>
-      </w:r>
-    </w:p>
-    <w:p>
-      <w:pPr>
-        <w:pStyle w:val="Bibliographie"/>
-      </w:pPr>
-      <w:r>
-        <w:t>[5]</w:t>
-      </w:r>
-      <w:r>
-        <w:tab/>
-        <w:t xml:space="preserve">A. Goshvarpour, A. Abbasi, et A. Goshvarpour, « An accurate emotion recognition system using ECG and GSR signals and matching pursuit method », </w:t>
-      </w:r>
+        <w:t xml:space="preserve">Front. </w:t>
+      </w:r>
+      <w:proofErr w:type="spellStart"/>
       <w:r>
         <w:rPr>
           <w:i/>
           <w:iCs/>
         </w:rPr>
-        <w:t>Biomed. J.</w:t>
-      </w:r>
-      <w:r>
-        <w:t>, vol. 40, n</w:t>
-      </w:r>
-      <w:r>
-        <w:rPr>
-          <w:vertAlign w:val="superscript"/>
-        </w:rPr>
-        <w:t>o</w:t>
-      </w:r>
-      <w:r>
-        <w:t xml:space="preserve"> 6, p. 355</w:t>
-      </w:r>
-      <w:r>
-        <w:rPr>
-          <w:rFonts w:ascii="Cambria Math" w:hAnsi="Cambria Math" w:cs="Cambria Math"/>
-        </w:rPr>
-        <w:t>‑</w:t>
-      </w:r>
-      <w:r>
-        <w:t>368, d</w:t>
-      </w:r>
-      <w:r>
-        <w:rPr>
-          <w:rFonts w:ascii="Calibri" w:hAnsi="Calibri" w:cs="Calibri"/>
-        </w:rPr>
-        <w:t>é</w:t>
-      </w:r>
-      <w:r>
-        <w:t>c. 2017, doi: 10.1016/j.bj.2017.11.001.</w:t>
-      </w:r>
-    </w:p>
-    <w:p>
-      <w:pPr>
-        <w:pStyle w:val="Bibliographie"/>
-      </w:pPr>
-      <w:r>
-        <w:t>[6]</w:t>
-      </w:r>
-      <w:r>
-        <w:tab/>
-        <w:t xml:space="preserve">E. M. van Fenema, P. Gal, M. V. van de Griend, G. E. Jacobs, et A. F. Cohen, « A Pilot Study Evaluating the Physiological Parameters of Performance-Induced Stress in Undergraduate Music Students », </w:t>
-      </w:r>
+        <w:t>Psychol</w:t>
+      </w:r>
+      <w:proofErr w:type="spellEnd"/>
       <w:r>
         <w:rPr>
           <w:i/>
           <w:iCs/>
         </w:rPr>
-        <w:t>Digit. Biomark.</w:t>
-      </w:r>
-      <w:r>
-        <w:t>, vol. 1, n</w:t>
-      </w:r>
-      <w:r>
-        <w:rPr>
-          <w:vertAlign w:val="superscript"/>
-        </w:rPr>
-        <w:t>o</w:t>
-      </w:r>
-      <w:r>
-        <w:t xml:space="preserve"> 2, p. 118</w:t>
-      </w:r>
-      <w:r>
-        <w:rPr>
-          <w:rFonts w:ascii="Cambria Math" w:hAnsi="Cambria Math" w:cs="Cambria Math"/>
-        </w:rPr>
-        <w:t>‑</w:t>
-      </w:r>
-      <w:r>
-        <w:t>125, janv. 2018, doi: 10.1159/000485469.</w:t>
+        <w:t>.</w:t>
+      </w:r>
+      <w:r>
+        <w:t xml:space="preserve">, vol. 16, p. 1576391, avr. 2025, </w:t>
+      </w:r>
+      <w:proofErr w:type="spellStart"/>
+      <w:proofErr w:type="gramStart"/>
+      <w:r>
+        <w:t>doi</w:t>
+      </w:r>
+      <w:proofErr w:type="spellEnd"/>
+      <w:r>
+        <w:t>:</w:t>
+      </w:r>
+      <w:proofErr w:type="gramEnd"/>
+      <w:r>
+        <w:t xml:space="preserve"> 10.3389/fpsyg.2025.1576391.</w:t>
+      </w:r>
+    </w:p>
+    <w:p>
+      <w:pPr>
+        <w:pStyle w:val="Titre1"/>
+      </w:pPr>
+      <w:r>
+        <w:t>Thème :</w:t>
+      </w:r>
+    </w:p>
+    <w:p>
+      <w:pPr>
+        <w:rPr>
+          <w:lang w:eastAsia="fr-BE"/>
+        </w:rPr>
+      </w:pPr>
+      <w:r>
+        <w:rPr>
+          <w:lang w:eastAsia="fr-BE"/>
+        </w:rPr>
+        <w:t>Modèle de stress pour comprendre l’APM</w:t>
+      </w:r>
+      <w:r>
+        <w:rPr>
+          <w:lang w:eastAsia="fr-BE"/>
+        </w:rPr>
+        <w:t xml:space="preserve"> </w:t>
+      </w:r>
+      <w:r>
+        <w:rPr>
+          <w:b/>
+          <w:lang w:eastAsia="fr-BE"/>
+        </w:rPr>
+        <w:t>(</w:t>
+      </w:r>
+      <w:r>
+        <w:rPr>
+          <w:b/>
+          <w:lang w:eastAsia="fr-BE"/>
+        </w:rPr>
+        <w:t>B, C</w:t>
+      </w:r>
+      <w:r>
+        <w:rPr>
+          <w:b/>
+          <w:lang w:eastAsia="fr-BE"/>
+        </w:rPr>
+        <w:t>)</w:t>
+      </w:r>
+    </w:p>
+    <w:p>
+      <w:pPr>
+        <w:pStyle w:val="Titre1"/>
+      </w:pPr>
+      <w:r>
+        <w:t>Résumé :</w:t>
+      </w:r>
+    </w:p>
+    <w:p>
+      <w:pPr>
+        <w:rPr>
+          <w:lang w:eastAsia="fr-BE"/>
+        </w:rPr>
+      </w:pPr>
+      <w:r>
+        <w:rPr>
+          <w:lang w:eastAsia="fr-BE"/>
+        </w:rPr>
+        <w:t xml:space="preserve">Revue théorique sur les modèles biopsychosociaux, défi/menaces, approches optimisation et </w:t>
+      </w:r>
+      <w:proofErr w:type="spellStart"/>
+      <w:r>
+        <w:rPr>
+          <w:lang w:eastAsia="fr-BE"/>
+        </w:rPr>
+        <w:t>mindset</w:t>
+      </w:r>
+      <w:proofErr w:type="spellEnd"/>
+      <w:r>
+        <w:rPr>
+          <w:lang w:eastAsia="fr-BE"/>
+        </w:rPr>
+        <w:t xml:space="preserve">. Différents profils : </w:t>
+      </w:r>
+    </w:p>
+    <w:p>
+      <w:pPr>
+        <w:pStyle w:val="Paragraphedeliste"/>
+        <w:numPr>
+          <w:ilvl w:val="0"/>
+          <w:numId w:val="1"/>
+        </w:numPr>
+        <w:rPr>
+          <w:lang w:eastAsia="fr-BE"/>
+        </w:rPr>
+      </w:pPr>
+      <w:r>
+        <w:rPr>
+          <w:lang w:eastAsia="fr-BE"/>
+        </w:rPr>
+        <w:t>Si ressources perçues &gt; les exigences = Stress facilitateur</w:t>
+      </w:r>
+    </w:p>
+    <w:p>
+      <w:pPr>
+        <w:pStyle w:val="Paragraphedeliste"/>
+        <w:numPr>
+          <w:ilvl w:val="0"/>
+          <w:numId w:val="1"/>
+        </w:numPr>
+        <w:rPr>
+          <w:lang w:eastAsia="fr-BE"/>
+        </w:rPr>
+      </w:pPr>
+      <w:r>
+        <w:rPr>
+          <w:lang w:eastAsia="fr-BE"/>
+        </w:rPr>
+        <w:t>Si exigences perçues &gt; les ressources = Stress négatif</w:t>
+      </w:r>
+      <w:r>
+        <w:rPr>
+          <w:lang w:eastAsia="fr-BE"/>
+        </w:rPr>
+        <w:tab/>
+      </w:r>
+    </w:p>
+    <w:p>
+      <w:pPr>
+        <w:pStyle w:val="Titre1"/>
+      </w:pPr>
+      <w:r>
+        <w:t>Limitations :</w:t>
+      </w:r>
+    </w:p>
+    <w:p>
+      <w:pPr>
+        <w:pStyle w:val="Titre1"/>
+      </w:pPr>
+      <w:r>
+        <w:t>Pertinence :</w:t>
+      </w:r>
+    </w:p>
+    <w:p>
+      <w:pPr>
+        <w:rPr>
+          <w:lang w:eastAsia="fr-BE"/>
+        </w:rPr>
+      </w:pPr>
+      <w:r>
+        <w:rPr>
+          <w:lang w:eastAsia="fr-BE"/>
+        </w:rPr>
+        <w:t xml:space="preserve">L’APM est un phénomène qui peut nuire ou favoriser selon comment elle est perçue. </w:t>
+      </w:r>
+    </w:p>
+    <w:p>
+      <w:pPr>
+        <w:pStyle w:val="Titre1"/>
+      </w:pPr>
+      <w:r>
+        <w:t>Score :</w:t>
+      </w:r>
+    </w:p>
+    <w:p>
+      <w:r>
+        <w:t>2</w:t>
+      </w:r>
+    </w:p>
+    <w:p>
+      <w:r>
+        <w:br w:type="page"/>
       </w:r>
     </w:p>
     <w:p>
@@ -5131,43 +5677,109 @@
         <w:pStyle w:val="Bibliographie"/>
       </w:pPr>
       <w:r>
-        <w:t>[7]</w:t>
+        <w:lastRenderedPageBreak/>
+        <w:fldChar w:fldCharType="begin"/>
+      </w:r>
+      <w:r>
+        <w:instrText xml:space="preserve"> ADDIN ZOTERO_BIBL {"uncited":[],"omitted":[],"custom":[]} CSL_BIBLIOGRAPHY </w:instrText>
+      </w:r>
+      <w:r>
+        <w:fldChar w:fldCharType="separate"/>
+      </w:r>
+      <w:r>
+        <w:t>[1]</w:t>
       </w:r>
       <w:r>
         <w:tab/>
-        <w:t xml:space="preserve">Y. S. Can, B. Arnrich, et C. Ersoy, « Stress detection in daily life scenarios using smart phones and wearable sensors: A survey », </w:t>
+        <w:t xml:space="preserve">D. R. </w:t>
+      </w:r>
+      <w:proofErr w:type="spellStart"/>
+      <w:r>
+        <w:t>McLeod</w:t>
+      </w:r>
+      <w:proofErr w:type="spellEnd"/>
+      <w:r>
+        <w:t xml:space="preserve">, R. </w:t>
+      </w:r>
+      <w:proofErr w:type="spellStart"/>
+      <w:r>
+        <w:t>Hoehn-Saric</w:t>
+      </w:r>
+      <w:proofErr w:type="spellEnd"/>
+      <w:r>
+        <w:t>, et R. L. Stefan, « </w:t>
+      </w:r>
+      <w:proofErr w:type="spellStart"/>
+      <w:r>
+        <w:t>Somatic</w:t>
+      </w:r>
+      <w:proofErr w:type="spellEnd"/>
+      <w:r>
+        <w:t xml:space="preserve"> </w:t>
+      </w:r>
+      <w:proofErr w:type="spellStart"/>
+      <w:r>
+        <w:t>symptoms</w:t>
+      </w:r>
+      <w:proofErr w:type="spellEnd"/>
+      <w:r>
+        <w:t xml:space="preserve"> of </w:t>
+      </w:r>
+      <w:proofErr w:type="spellStart"/>
+      <w:proofErr w:type="gramStart"/>
+      <w:r>
+        <w:t>anxiety</w:t>
+      </w:r>
+      <w:proofErr w:type="spellEnd"/>
+      <w:r>
+        <w:t>:</w:t>
+      </w:r>
+      <w:proofErr w:type="gramEnd"/>
+      <w:r>
+        <w:t xml:space="preserve"> </w:t>
+      </w:r>
+      <w:proofErr w:type="spellStart"/>
+      <w:r>
+        <w:t>Comparison</w:t>
+      </w:r>
+      <w:proofErr w:type="spellEnd"/>
+      <w:r>
+        <w:t xml:space="preserve"> of self-report and </w:t>
+      </w:r>
+      <w:proofErr w:type="spellStart"/>
+      <w:r>
+        <w:t>physiological</w:t>
+      </w:r>
+      <w:proofErr w:type="spellEnd"/>
+      <w:r>
+        <w:t xml:space="preserve"> </w:t>
+      </w:r>
+      <w:proofErr w:type="spellStart"/>
+      <w:r>
+        <w:t>measures</w:t>
+      </w:r>
+      <w:proofErr w:type="spellEnd"/>
+      <w:r>
+        <w:t xml:space="preserve"> », </w:t>
       </w:r>
       <w:r>
         <w:rPr>
           <w:i/>
           <w:iCs/>
         </w:rPr>
-        <w:t>J. Biomed. Inform.</w:t>
-      </w:r>
-      <w:r>
-        <w:t>, vol. 92, p. 103139, avr. 2019, doi: 10.1016/j.jbi.2019.103139.</w:t>
-      </w:r>
-    </w:p>
-    <w:p>
-      <w:pPr>
-        <w:pStyle w:val="Bibliographie"/>
-      </w:pPr>
-      <w:r>
-        <w:t>[8]</w:t>
-      </w:r>
-      <w:r>
-        <w:tab/>
-        <w:t xml:space="preserve">J. Dang, K. M. King, et M. Inzlicht, « Why Are Self-Report and Behavioral Measures Weakly Correlated? », </w:t>
-      </w:r>
+        <w:t xml:space="preserve">Biol. </w:t>
+      </w:r>
+      <w:proofErr w:type="spellStart"/>
       <w:r>
         <w:rPr>
           <w:i/>
           <w:iCs/>
         </w:rPr>
-        <w:t>Trends Cogn. Sci.</w:t>
-      </w:r>
-      <w:r>
-        <w:t>, vol. 24, n</w:t>
+        <w:t>Psychiatry</w:t>
+      </w:r>
+      <w:proofErr w:type="spellEnd"/>
+      <w:r>
+        <w:t>, vol. 21, n</w:t>
       </w:r>
       <w:r>
         <w:rPr>
@@ -5176,7 +5788,7 @@
         <w:t>o</w:t>
       </w:r>
       <w:r>
-        <w:t xml:space="preserve"> 4, p. 267</w:t>
+        <w:t xml:space="preserve"> 3, p. 301</w:t>
       </w:r>
       <w:r>
         <w:rPr>
@@ -5185,7 +5797,15 @@
         <w:t>‑</w:t>
       </w:r>
       <w:r>
-        <w:t>269, avr. 2020, doi: 10.1016/j.tics.2020.01.007.</w:t>
+        <w:t xml:space="preserve">310, mars 1986, </w:t>
+      </w:r>
+      <w:proofErr w:type="spellStart"/>
+      <w:r>
+        <w:t>doi</w:t>
+      </w:r>
+      <w:proofErr w:type="spellEnd"/>
+      <w:r>
+        <w:t>: 10.1016/0006-3223(86)90051-X.</w:t>
       </w:r>
     </w:p>
     <w:p>
@@ -5193,21 +5813,107 @@
         <w:pStyle w:val="Bibliographie"/>
       </w:pPr>
       <w:r>
-        <w:t>[9]</w:t>
+        <w:t>[2]</w:t>
       </w:r>
       <w:r>
         <w:tab/>
-        <w:t xml:space="preserve">A. Arsalan et M. Majid, « Human stress classification during public speaking using physiological signals », </w:t>
+        <w:t xml:space="preserve">A. </w:t>
+      </w:r>
+      <w:proofErr w:type="spellStart"/>
+      <w:r>
+        <w:t>Williamon</w:t>
+      </w:r>
+      <w:proofErr w:type="spellEnd"/>
+      <w:r>
+        <w:t xml:space="preserve">, L. </w:t>
+      </w:r>
+      <w:proofErr w:type="spellStart"/>
+      <w:r>
+        <w:t>Aufegger</w:t>
+      </w:r>
+      <w:proofErr w:type="spellEnd"/>
+      <w:r>
+        <w:t xml:space="preserve">, D. </w:t>
+      </w:r>
+      <w:proofErr w:type="spellStart"/>
+      <w:r>
+        <w:t>Wasley</w:t>
+      </w:r>
+      <w:proofErr w:type="spellEnd"/>
+      <w:r>
+        <w:t xml:space="preserve">, D. Looney, et D. P. </w:t>
+      </w:r>
+      <w:proofErr w:type="spellStart"/>
+      <w:r>
+        <w:t>Mandic</w:t>
+      </w:r>
+      <w:proofErr w:type="spellEnd"/>
+      <w:r>
+        <w:t>, « </w:t>
+      </w:r>
+      <w:proofErr w:type="spellStart"/>
+      <w:r>
+        <w:t>Complexity</w:t>
+      </w:r>
+      <w:proofErr w:type="spellEnd"/>
+      <w:r>
+        <w:t xml:space="preserve"> of </w:t>
+      </w:r>
+      <w:proofErr w:type="spellStart"/>
+      <w:r>
+        <w:t>physiological</w:t>
+      </w:r>
+      <w:proofErr w:type="spellEnd"/>
+      <w:r>
+        <w:t xml:space="preserve"> </w:t>
+      </w:r>
+      <w:proofErr w:type="spellStart"/>
+      <w:r>
+        <w:t>responses</w:t>
+      </w:r>
+      <w:proofErr w:type="spellEnd"/>
+      <w:r>
+        <w:t xml:space="preserve"> </w:t>
+      </w:r>
+      <w:proofErr w:type="spellStart"/>
+      <w:r>
+        <w:t>decreases</w:t>
+      </w:r>
+      <w:proofErr w:type="spellEnd"/>
+      <w:r>
+        <w:t xml:space="preserve"> in high-stress musical performance », </w:t>
       </w:r>
       <w:r>
         <w:rPr>
           <w:i/>
           <w:iCs/>
         </w:rPr>
-        <w:t>Comput. Biol. Med.</w:t>
-      </w:r>
-      <w:r>
-        <w:t>, vol. 133, p. 104377, juin 2021, doi: 10.1016/j.compbiomed.2021.104377.</w:t>
+        <w:t>J. R. Soc. Interface</w:t>
+      </w:r>
+      <w:r>
+        <w:t>, vol. 10, n</w:t>
+      </w:r>
+      <w:r>
+        <w:rPr>
+          <w:vertAlign w:val="superscript"/>
+        </w:rPr>
+        <w:t>o</w:t>
+      </w:r>
+      <w:r>
+        <w:t xml:space="preserve"> 89, p. 20130719, déc. 2013, </w:t>
+      </w:r>
+      <w:proofErr w:type="spellStart"/>
+      <w:proofErr w:type="gramStart"/>
+      <w:r>
+        <w:t>doi</w:t>
+      </w:r>
+      <w:proofErr w:type="spellEnd"/>
+      <w:r>
+        <w:t>:</w:t>
+      </w:r>
+      <w:proofErr w:type="gramEnd"/>
+      <w:r>
+        <w:t xml:space="preserve"> 10.1098/rsif.2013.0719.</w:t>
       </w:r>
     </w:p>
     <w:p>
@@ -5215,17 +5921,890 @@
         <w:pStyle w:val="Bibliographie"/>
       </w:pPr>
       <w:r>
-        <w:t>[10]</w:t>
+        <w:t>[3]</w:t>
       </w:r>
       <w:r>
         <w:tab/>
-        <w:t xml:space="preserve">T. Iqbal, A. Elahi, P. Redon, P. Vazquez, W. Wijns, et A. Shahzad, « A Review of Biophysiological and Biochemical Indicators of Stress for Connected and Preventive Healthcare », </w:t>
+        <w:t xml:space="preserve">D. </w:t>
+      </w:r>
+      <w:proofErr w:type="spellStart"/>
+      <w:r>
+        <w:t>Ciuk</w:t>
+      </w:r>
+      <w:proofErr w:type="spellEnd"/>
+      <w:r>
+        <w:t>, A. K. Troy, et M. C. Jones, « </w:t>
+      </w:r>
+      <w:proofErr w:type="spellStart"/>
+      <w:r>
+        <w:t>Measuring</w:t>
+      </w:r>
+      <w:proofErr w:type="spellEnd"/>
+      <w:r>
+        <w:t xml:space="preserve"> </w:t>
+      </w:r>
+      <w:proofErr w:type="gramStart"/>
+      <w:r>
+        <w:t>Emotion:</w:t>
+      </w:r>
+      <w:proofErr w:type="gramEnd"/>
+      <w:r>
+        <w:t xml:space="preserve"> Self-Reports vs. </w:t>
+      </w:r>
+      <w:proofErr w:type="spellStart"/>
+      <w:r>
+        <w:t>Physiological</w:t>
+      </w:r>
+      <w:proofErr w:type="spellEnd"/>
+      <w:r>
+        <w:t xml:space="preserve"> </w:t>
+      </w:r>
+      <w:proofErr w:type="spellStart"/>
+      <w:r>
+        <w:t>Indicators</w:t>
+      </w:r>
+      <w:proofErr w:type="spellEnd"/>
+      <w:r>
+        <w:t xml:space="preserve"> », </w:t>
       </w:r>
       <w:r>
         <w:rPr>
           <w:i/>
           <w:iCs/>
         </w:rPr>
+        <w:t>SSRN Electron. J.</w:t>
+      </w:r>
+      <w:r>
+        <w:t xml:space="preserve">, 2015, </w:t>
+      </w:r>
+      <w:proofErr w:type="spellStart"/>
+      <w:proofErr w:type="gramStart"/>
+      <w:r>
+        <w:t>doi</w:t>
+      </w:r>
+      <w:proofErr w:type="spellEnd"/>
+      <w:r>
+        <w:t>:</w:t>
+      </w:r>
+      <w:proofErr w:type="gramEnd"/>
+      <w:r>
+        <w:t xml:space="preserve"> 10.2139/ssrn.2595359.</w:t>
+      </w:r>
+    </w:p>
+    <w:p>
+      <w:pPr>
+        <w:pStyle w:val="Bibliographie"/>
+      </w:pPr>
+      <w:r>
+        <w:t>[4]</w:t>
+      </w:r>
+      <w:r>
+        <w:tab/>
+        <w:t xml:space="preserve">F. Hernando-Gallego et A. </w:t>
+      </w:r>
+      <w:proofErr w:type="spellStart"/>
+      <w:r>
+        <w:t>Artés-Rodríguez</w:t>
+      </w:r>
+      <w:proofErr w:type="spellEnd"/>
+      <w:r>
+        <w:t>, « </w:t>
+      </w:r>
+      <w:proofErr w:type="spellStart"/>
+      <w:r>
+        <w:t>Individual</w:t>
+      </w:r>
+      <w:proofErr w:type="spellEnd"/>
+      <w:r>
+        <w:t xml:space="preserve"> performance calibration </w:t>
+      </w:r>
+      <w:proofErr w:type="spellStart"/>
+      <w:r>
+        <w:t>using</w:t>
+      </w:r>
+      <w:proofErr w:type="spellEnd"/>
+      <w:r>
+        <w:t xml:space="preserve"> </w:t>
+      </w:r>
+      <w:proofErr w:type="spellStart"/>
+      <w:r>
+        <w:t>physiological</w:t>
+      </w:r>
+      <w:proofErr w:type="spellEnd"/>
+      <w:r>
+        <w:t xml:space="preserve"> stress </w:t>
+      </w:r>
+      <w:proofErr w:type="spellStart"/>
+      <w:r>
+        <w:t>signals</w:t>
+      </w:r>
+      <w:proofErr w:type="spellEnd"/>
+      <w:r>
+        <w:t xml:space="preserve"> », 2015, </w:t>
+      </w:r>
+      <w:proofErr w:type="spellStart"/>
+      <w:r>
+        <w:rPr>
+          <w:i/>
+          <w:iCs/>
+        </w:rPr>
+        <w:t>arXiv</w:t>
+      </w:r>
+      <w:proofErr w:type="spellEnd"/>
+      <w:r>
+        <w:t xml:space="preserve">. </w:t>
+      </w:r>
+      <w:proofErr w:type="spellStart"/>
+      <w:proofErr w:type="gramStart"/>
+      <w:r>
+        <w:t>doi</w:t>
+      </w:r>
+      <w:proofErr w:type="spellEnd"/>
+      <w:r>
+        <w:t>:</w:t>
+      </w:r>
+      <w:proofErr w:type="gramEnd"/>
+      <w:r>
+        <w:t xml:space="preserve"> 10.48550/ARXIV.1507.03482.</w:t>
+      </w:r>
+    </w:p>
+    <w:p>
+      <w:pPr>
+        <w:pStyle w:val="Bibliographie"/>
+      </w:pPr>
+      <w:r>
+        <w:t>[5]</w:t>
+      </w:r>
+      <w:r>
+        <w:tab/>
+        <w:t xml:space="preserve">A. </w:t>
+      </w:r>
+      <w:proofErr w:type="spellStart"/>
+      <w:r>
+        <w:t>Goshvarpour</w:t>
+      </w:r>
+      <w:proofErr w:type="spellEnd"/>
+      <w:r>
+        <w:t xml:space="preserve">, A. </w:t>
+      </w:r>
+      <w:proofErr w:type="spellStart"/>
+      <w:r>
+        <w:t>Abbasi</w:t>
+      </w:r>
+      <w:proofErr w:type="spellEnd"/>
+      <w:r>
+        <w:t xml:space="preserve">, et A. </w:t>
+      </w:r>
+      <w:proofErr w:type="spellStart"/>
+      <w:r>
+        <w:t>Goshvarpour</w:t>
+      </w:r>
+      <w:proofErr w:type="spellEnd"/>
+      <w:r>
+        <w:t xml:space="preserve">, « An </w:t>
+      </w:r>
+      <w:proofErr w:type="spellStart"/>
+      <w:r>
+        <w:t>accurate</w:t>
+      </w:r>
+      <w:proofErr w:type="spellEnd"/>
+      <w:r>
+        <w:t xml:space="preserve"> </w:t>
+      </w:r>
+      <w:proofErr w:type="spellStart"/>
+      <w:r>
+        <w:t>emotion</w:t>
+      </w:r>
+      <w:proofErr w:type="spellEnd"/>
+      <w:r>
+        <w:t xml:space="preserve"> recognition system </w:t>
+      </w:r>
+      <w:proofErr w:type="spellStart"/>
+      <w:r>
+        <w:t>using</w:t>
+      </w:r>
+      <w:proofErr w:type="spellEnd"/>
+      <w:r>
+        <w:t xml:space="preserve"> ECG and GSR </w:t>
+      </w:r>
+      <w:proofErr w:type="spellStart"/>
+      <w:r>
+        <w:t>signals</w:t>
+      </w:r>
+      <w:proofErr w:type="spellEnd"/>
+      <w:r>
+        <w:t xml:space="preserve"> and </w:t>
+      </w:r>
+      <w:proofErr w:type="spellStart"/>
+      <w:r>
+        <w:t>matching</w:t>
+      </w:r>
+      <w:proofErr w:type="spellEnd"/>
+      <w:r>
+        <w:t xml:space="preserve"> </w:t>
+      </w:r>
+      <w:proofErr w:type="spellStart"/>
+      <w:r>
+        <w:t>pursuit</w:t>
+      </w:r>
+      <w:proofErr w:type="spellEnd"/>
+      <w:r>
+        <w:t xml:space="preserve"> </w:t>
+      </w:r>
+      <w:proofErr w:type="spellStart"/>
+      <w:r>
+        <w:t>method</w:t>
+      </w:r>
+      <w:proofErr w:type="spellEnd"/>
+      <w:r>
+        <w:t xml:space="preserve"> », </w:t>
+      </w:r>
+      <w:proofErr w:type="spellStart"/>
+      <w:r>
+        <w:rPr>
+          <w:i/>
+          <w:iCs/>
+        </w:rPr>
+        <w:t>Biomed</w:t>
+      </w:r>
+      <w:proofErr w:type="spellEnd"/>
+      <w:r>
+        <w:rPr>
+          <w:i/>
+          <w:iCs/>
+        </w:rPr>
+        <w:t>. J.</w:t>
+      </w:r>
+      <w:r>
+        <w:t>, vol. 40, n</w:t>
+      </w:r>
+      <w:r>
+        <w:rPr>
+          <w:vertAlign w:val="superscript"/>
+        </w:rPr>
+        <w:t>o</w:t>
+      </w:r>
+      <w:r>
+        <w:t xml:space="preserve"> 6, p. 355</w:t>
+      </w:r>
+      <w:r>
+        <w:rPr>
+          <w:rFonts w:ascii="Cambria Math" w:hAnsi="Cambria Math" w:cs="Cambria Math"/>
+        </w:rPr>
+        <w:t>‑</w:t>
+      </w:r>
+      <w:r>
+        <w:t>368, d</w:t>
+      </w:r>
+      <w:r>
+        <w:rPr>
+          <w:rFonts w:ascii="Calibri" w:hAnsi="Calibri" w:cs="Calibri"/>
+        </w:rPr>
+        <w:t>é</w:t>
+      </w:r>
+      <w:r>
+        <w:t xml:space="preserve">c. 2017, </w:t>
+      </w:r>
+      <w:proofErr w:type="spellStart"/>
+      <w:proofErr w:type="gramStart"/>
+      <w:r>
+        <w:t>doi</w:t>
+      </w:r>
+      <w:proofErr w:type="spellEnd"/>
+      <w:r>
+        <w:t>:</w:t>
+      </w:r>
+      <w:proofErr w:type="gramEnd"/>
+      <w:r>
+        <w:t xml:space="preserve"> 10.1016/j.bj.2017.11.001.</w:t>
+      </w:r>
+    </w:p>
+    <w:p>
+      <w:pPr>
+        <w:pStyle w:val="Bibliographie"/>
+      </w:pPr>
+      <w:r>
+        <w:t>[6]</w:t>
+      </w:r>
+      <w:r>
+        <w:tab/>
+        <w:t>E. M. van </w:t>
+      </w:r>
+      <w:proofErr w:type="spellStart"/>
+      <w:r>
+        <w:t>Fenema</w:t>
+      </w:r>
+      <w:proofErr w:type="spellEnd"/>
+      <w:r>
+        <w:t>, P. Gal, M. V. van de </w:t>
+      </w:r>
+      <w:proofErr w:type="spellStart"/>
+      <w:r>
+        <w:t>Griend</w:t>
+      </w:r>
+      <w:proofErr w:type="spellEnd"/>
+      <w:r>
+        <w:t xml:space="preserve">, G. E. Jacobs, et A. F. Cohen, « A Pilot </w:t>
+      </w:r>
+      <w:proofErr w:type="spellStart"/>
+      <w:r>
+        <w:t>Study</w:t>
+      </w:r>
+      <w:proofErr w:type="spellEnd"/>
+      <w:r>
+        <w:t xml:space="preserve"> </w:t>
+      </w:r>
+      <w:proofErr w:type="spellStart"/>
+      <w:r>
+        <w:t>Evaluating</w:t>
+      </w:r>
+      <w:proofErr w:type="spellEnd"/>
+      <w:r>
+        <w:t xml:space="preserve"> the </w:t>
+      </w:r>
+      <w:proofErr w:type="spellStart"/>
+      <w:r>
+        <w:t>Physiological</w:t>
+      </w:r>
+      <w:proofErr w:type="spellEnd"/>
+      <w:r>
+        <w:t xml:space="preserve"> </w:t>
+      </w:r>
+      <w:proofErr w:type="spellStart"/>
+      <w:r>
+        <w:t>Parameters</w:t>
+      </w:r>
+      <w:proofErr w:type="spellEnd"/>
+      <w:r>
+        <w:t xml:space="preserve"> of Performance-</w:t>
+      </w:r>
+      <w:proofErr w:type="spellStart"/>
+      <w:r>
+        <w:t>Induced</w:t>
+      </w:r>
+      <w:proofErr w:type="spellEnd"/>
+      <w:r>
+        <w:t xml:space="preserve"> Stress in </w:t>
+      </w:r>
+      <w:proofErr w:type="spellStart"/>
+      <w:r>
+        <w:t>Undergraduate</w:t>
+      </w:r>
+      <w:proofErr w:type="spellEnd"/>
+      <w:r>
+        <w:t xml:space="preserve"> Music </w:t>
+      </w:r>
+      <w:proofErr w:type="spellStart"/>
+      <w:r>
+        <w:t>Students</w:t>
+      </w:r>
+      <w:proofErr w:type="spellEnd"/>
+      <w:r>
+        <w:t xml:space="preserve"> », </w:t>
+      </w:r>
+      <w:r>
+        <w:rPr>
+          <w:i/>
+          <w:iCs/>
+        </w:rPr>
+        <w:t xml:space="preserve">Digit. </w:t>
+      </w:r>
+      <w:proofErr w:type="spellStart"/>
+      <w:r>
+        <w:rPr>
+          <w:i/>
+          <w:iCs/>
+        </w:rPr>
+        <w:t>Biomark</w:t>
+      </w:r>
+      <w:proofErr w:type="spellEnd"/>
+      <w:r>
+        <w:rPr>
+          <w:i/>
+          <w:iCs/>
+        </w:rPr>
+        <w:t>.</w:t>
+      </w:r>
+      <w:r>
+        <w:t>, vol. 1, n</w:t>
+      </w:r>
+      <w:r>
+        <w:rPr>
+          <w:vertAlign w:val="superscript"/>
+        </w:rPr>
+        <w:t>o</w:t>
+      </w:r>
+      <w:r>
+        <w:t xml:space="preserve"> 2, p. 118</w:t>
+      </w:r>
+      <w:r>
+        <w:rPr>
+          <w:rFonts w:ascii="Cambria Math" w:hAnsi="Cambria Math" w:cs="Cambria Math"/>
+        </w:rPr>
+        <w:t>‑</w:t>
+      </w:r>
+      <w:r>
+        <w:t xml:space="preserve">125, janv. 2018, </w:t>
+      </w:r>
+      <w:proofErr w:type="spellStart"/>
+      <w:proofErr w:type="gramStart"/>
+      <w:r>
+        <w:t>doi</w:t>
+      </w:r>
+      <w:proofErr w:type="spellEnd"/>
+      <w:r>
+        <w:t>:</w:t>
+      </w:r>
+      <w:proofErr w:type="gramEnd"/>
+      <w:r>
+        <w:t xml:space="preserve"> 10.1159/000485469.</w:t>
+      </w:r>
+    </w:p>
+    <w:p>
+      <w:pPr>
+        <w:pStyle w:val="Bibliographie"/>
+      </w:pPr>
+      <w:r>
+        <w:t>[7]</w:t>
+      </w:r>
+      <w:r>
+        <w:tab/>
+        <w:t xml:space="preserve">Y. S. Can, B. </w:t>
+      </w:r>
+      <w:proofErr w:type="spellStart"/>
+      <w:r>
+        <w:t>Arnrich</w:t>
+      </w:r>
+      <w:proofErr w:type="spellEnd"/>
+      <w:r>
+        <w:t xml:space="preserve">, et C. </w:t>
+      </w:r>
+      <w:proofErr w:type="spellStart"/>
+      <w:r>
+        <w:t>Ersoy</w:t>
+      </w:r>
+      <w:proofErr w:type="spellEnd"/>
+      <w:r>
+        <w:t xml:space="preserve">, « Stress </w:t>
+      </w:r>
+      <w:proofErr w:type="spellStart"/>
+      <w:r>
+        <w:t>detection</w:t>
+      </w:r>
+      <w:proofErr w:type="spellEnd"/>
+      <w:r>
+        <w:t xml:space="preserve"> in </w:t>
+      </w:r>
+      <w:proofErr w:type="spellStart"/>
+      <w:r>
+        <w:t>daily</w:t>
+      </w:r>
+      <w:proofErr w:type="spellEnd"/>
+      <w:r>
+        <w:t xml:space="preserve"> life scenarios </w:t>
+      </w:r>
+      <w:proofErr w:type="spellStart"/>
+      <w:r>
+        <w:t>using</w:t>
+      </w:r>
+      <w:proofErr w:type="spellEnd"/>
+      <w:r>
+        <w:t xml:space="preserve"> smart phones and </w:t>
+      </w:r>
+      <w:proofErr w:type="spellStart"/>
+      <w:r>
+        <w:t>wearable</w:t>
+      </w:r>
+      <w:proofErr w:type="spellEnd"/>
+      <w:r>
+        <w:t xml:space="preserve"> </w:t>
+      </w:r>
+      <w:proofErr w:type="spellStart"/>
+      <w:proofErr w:type="gramStart"/>
+      <w:r>
+        <w:t>sensors</w:t>
+      </w:r>
+      <w:proofErr w:type="spellEnd"/>
+      <w:r>
+        <w:t>:</w:t>
+      </w:r>
+      <w:proofErr w:type="gramEnd"/>
+      <w:r>
+        <w:t xml:space="preserve"> A </w:t>
+      </w:r>
+      <w:proofErr w:type="spellStart"/>
+      <w:r>
+        <w:t>survey</w:t>
+      </w:r>
+      <w:proofErr w:type="spellEnd"/>
+      <w:r>
+        <w:t xml:space="preserve"> », </w:t>
+      </w:r>
+      <w:r>
+        <w:rPr>
+          <w:i/>
+          <w:iCs/>
+        </w:rPr>
+        <w:t xml:space="preserve">J. </w:t>
+      </w:r>
+      <w:proofErr w:type="spellStart"/>
+      <w:r>
+        <w:rPr>
+          <w:i/>
+          <w:iCs/>
+        </w:rPr>
+        <w:t>Biomed</w:t>
+      </w:r>
+      <w:proofErr w:type="spellEnd"/>
+      <w:r>
+        <w:rPr>
+          <w:i/>
+          <w:iCs/>
+        </w:rPr>
+        <w:t xml:space="preserve">. </w:t>
+      </w:r>
+      <w:proofErr w:type="spellStart"/>
+      <w:r>
+        <w:rPr>
+          <w:i/>
+          <w:iCs/>
+        </w:rPr>
+        <w:t>Inform</w:t>
+      </w:r>
+      <w:proofErr w:type="spellEnd"/>
+      <w:r>
+        <w:rPr>
+          <w:i/>
+          <w:iCs/>
+        </w:rPr>
+        <w:t>.</w:t>
+      </w:r>
+      <w:r>
+        <w:t xml:space="preserve">, vol. 92, p. 103139, avr. 2019, </w:t>
+      </w:r>
+      <w:proofErr w:type="spellStart"/>
+      <w:proofErr w:type="gramStart"/>
+      <w:r>
+        <w:t>doi</w:t>
+      </w:r>
+      <w:proofErr w:type="spellEnd"/>
+      <w:r>
+        <w:t>:</w:t>
+      </w:r>
+      <w:proofErr w:type="gramEnd"/>
+      <w:r>
+        <w:t xml:space="preserve"> 10.1016/j.jbi.2019.103139.</w:t>
+      </w:r>
+    </w:p>
+    <w:p>
+      <w:pPr>
+        <w:pStyle w:val="Bibliographie"/>
+      </w:pPr>
+      <w:r>
+        <w:t>[8]</w:t>
+      </w:r>
+      <w:r>
+        <w:tab/>
+        <w:t xml:space="preserve">J. Dang, K. M. King, et M. </w:t>
+      </w:r>
+      <w:proofErr w:type="spellStart"/>
+      <w:r>
+        <w:t>Inzlicht</w:t>
+      </w:r>
+      <w:proofErr w:type="spellEnd"/>
+      <w:r>
+        <w:t>, « </w:t>
+      </w:r>
+      <w:proofErr w:type="spellStart"/>
+      <w:r>
+        <w:t>Why</w:t>
+      </w:r>
+      <w:proofErr w:type="spellEnd"/>
+      <w:r>
+        <w:t xml:space="preserve"> Are Self-Report and </w:t>
+      </w:r>
+      <w:proofErr w:type="spellStart"/>
+      <w:r>
+        <w:t>Behavioral</w:t>
+      </w:r>
+      <w:proofErr w:type="spellEnd"/>
+      <w:r>
+        <w:t xml:space="preserve"> </w:t>
+      </w:r>
+      <w:proofErr w:type="spellStart"/>
+      <w:r>
+        <w:t>Measures</w:t>
+      </w:r>
+      <w:proofErr w:type="spellEnd"/>
+      <w:r>
+        <w:t xml:space="preserve"> </w:t>
+      </w:r>
+      <w:proofErr w:type="spellStart"/>
+      <w:r>
+        <w:t>Weakly</w:t>
+      </w:r>
+      <w:proofErr w:type="spellEnd"/>
+      <w:r>
+        <w:t xml:space="preserve"> </w:t>
+      </w:r>
+      <w:proofErr w:type="spellStart"/>
+      <w:proofErr w:type="gramStart"/>
+      <w:r>
+        <w:t>Correlated</w:t>
+      </w:r>
+      <w:proofErr w:type="spellEnd"/>
+      <w:r>
+        <w:t>?</w:t>
+      </w:r>
+      <w:proofErr w:type="gramEnd"/>
+      <w:r>
+        <w:t xml:space="preserve"> », </w:t>
+      </w:r>
+      <w:r>
+        <w:rPr>
+          <w:i/>
+          <w:iCs/>
+        </w:rPr>
+        <w:t xml:space="preserve">Trends </w:t>
+      </w:r>
+      <w:proofErr w:type="spellStart"/>
+      <w:r>
+        <w:rPr>
+          <w:i/>
+          <w:iCs/>
+        </w:rPr>
+        <w:t>Cogn</w:t>
+      </w:r>
+      <w:proofErr w:type="spellEnd"/>
+      <w:r>
+        <w:rPr>
+          <w:i/>
+          <w:iCs/>
+        </w:rPr>
+        <w:t xml:space="preserve">. </w:t>
+      </w:r>
+      <w:proofErr w:type="spellStart"/>
+      <w:r>
+        <w:rPr>
+          <w:i/>
+          <w:iCs/>
+        </w:rPr>
+        <w:t>Sci</w:t>
+      </w:r>
+      <w:proofErr w:type="spellEnd"/>
+      <w:r>
+        <w:rPr>
+          <w:i/>
+          <w:iCs/>
+        </w:rPr>
+        <w:t>.</w:t>
+      </w:r>
+      <w:r>
+        <w:t>, vol. 24, n</w:t>
+      </w:r>
+      <w:r>
+        <w:rPr>
+          <w:vertAlign w:val="superscript"/>
+        </w:rPr>
+        <w:t>o</w:t>
+      </w:r>
+      <w:r>
+        <w:t xml:space="preserve"> 4, p. 267</w:t>
+      </w:r>
+      <w:r>
+        <w:rPr>
+          <w:rFonts w:ascii="Cambria Math" w:hAnsi="Cambria Math" w:cs="Cambria Math"/>
+        </w:rPr>
+        <w:t>‑</w:t>
+      </w:r>
+      <w:r>
+        <w:t xml:space="preserve">269, avr. 2020, </w:t>
+      </w:r>
+      <w:proofErr w:type="spellStart"/>
+      <w:proofErr w:type="gramStart"/>
+      <w:r>
+        <w:t>doi</w:t>
+      </w:r>
+      <w:proofErr w:type="spellEnd"/>
+      <w:r>
+        <w:t>:</w:t>
+      </w:r>
+      <w:proofErr w:type="gramEnd"/>
+      <w:r>
+        <w:t xml:space="preserve"> 10.1016/j.tics.2020.01.007.</w:t>
+      </w:r>
+    </w:p>
+    <w:p>
+      <w:pPr>
+        <w:pStyle w:val="Bibliographie"/>
+      </w:pPr>
+      <w:r>
+        <w:t>[9]</w:t>
+      </w:r>
+      <w:r>
+        <w:tab/>
+        <w:t xml:space="preserve">A. </w:t>
+      </w:r>
+      <w:proofErr w:type="spellStart"/>
+      <w:r>
+        <w:t>Arsalan</w:t>
+      </w:r>
+      <w:proofErr w:type="spellEnd"/>
+      <w:r>
+        <w:t xml:space="preserve"> et M. Majid, « Human stress classification </w:t>
+      </w:r>
+      <w:proofErr w:type="spellStart"/>
+      <w:r>
+        <w:t>during</w:t>
+      </w:r>
+      <w:proofErr w:type="spellEnd"/>
+      <w:r>
+        <w:t xml:space="preserve"> public </w:t>
+      </w:r>
+      <w:proofErr w:type="spellStart"/>
+      <w:r>
+        <w:t>speaking</w:t>
+      </w:r>
+      <w:proofErr w:type="spellEnd"/>
+      <w:r>
+        <w:t xml:space="preserve"> </w:t>
+      </w:r>
+      <w:proofErr w:type="spellStart"/>
+      <w:r>
+        <w:t>using</w:t>
+      </w:r>
+      <w:proofErr w:type="spellEnd"/>
+      <w:r>
+        <w:t xml:space="preserve"> </w:t>
+      </w:r>
+      <w:proofErr w:type="spellStart"/>
+      <w:r>
+        <w:t>physiological</w:t>
+      </w:r>
+      <w:proofErr w:type="spellEnd"/>
+      <w:r>
+        <w:t xml:space="preserve"> </w:t>
+      </w:r>
+      <w:proofErr w:type="spellStart"/>
+      <w:r>
+        <w:t>signals</w:t>
+      </w:r>
+      <w:proofErr w:type="spellEnd"/>
+      <w:r>
+        <w:t xml:space="preserve"> », </w:t>
+      </w:r>
+      <w:r>
+        <w:rPr>
+          <w:i/>
+          <w:iCs/>
+        </w:rPr>
+        <w:t>Comput. Biol. Med.</w:t>
+      </w:r>
+      <w:r>
+        <w:t xml:space="preserve">, vol. 133, p. 104377, juin 2021, </w:t>
+      </w:r>
+      <w:proofErr w:type="spellStart"/>
+      <w:proofErr w:type="gramStart"/>
+      <w:r>
+        <w:t>doi</w:t>
+      </w:r>
+      <w:proofErr w:type="spellEnd"/>
+      <w:r>
+        <w:t>:</w:t>
+      </w:r>
+      <w:proofErr w:type="gramEnd"/>
+      <w:r>
+        <w:t xml:space="preserve"> 10.1016/j.compbiomed.2021.104377.</w:t>
+      </w:r>
+    </w:p>
+    <w:p>
+      <w:pPr>
+        <w:pStyle w:val="Bibliographie"/>
+      </w:pPr>
+      <w:r>
+        <w:t>[10]</w:t>
+      </w:r>
+      <w:r>
+        <w:tab/>
+        <w:t xml:space="preserve">T. Iqbal, A. </w:t>
+      </w:r>
+      <w:proofErr w:type="spellStart"/>
+      <w:r>
+        <w:t>Elahi</w:t>
+      </w:r>
+      <w:proofErr w:type="spellEnd"/>
+      <w:r>
+        <w:t xml:space="preserve">, P. Redon, P. Vazquez, W. </w:t>
+      </w:r>
+      <w:proofErr w:type="spellStart"/>
+      <w:r>
+        <w:t>Wijns</w:t>
+      </w:r>
+      <w:proofErr w:type="spellEnd"/>
+      <w:r>
+        <w:t xml:space="preserve">, et A. </w:t>
+      </w:r>
+      <w:proofErr w:type="spellStart"/>
+      <w:r>
+        <w:t>Shahzad</w:t>
+      </w:r>
+      <w:proofErr w:type="spellEnd"/>
+      <w:r>
+        <w:t xml:space="preserve">, « A </w:t>
+      </w:r>
+      <w:proofErr w:type="spellStart"/>
+      <w:r>
+        <w:t>Review</w:t>
+      </w:r>
+      <w:proofErr w:type="spellEnd"/>
+      <w:r>
+        <w:t xml:space="preserve"> of </w:t>
+      </w:r>
+      <w:proofErr w:type="spellStart"/>
+      <w:r>
+        <w:t>Biophysiological</w:t>
+      </w:r>
+      <w:proofErr w:type="spellEnd"/>
+      <w:r>
+        <w:t xml:space="preserve"> and </w:t>
+      </w:r>
+      <w:proofErr w:type="spellStart"/>
+      <w:r>
+        <w:t>Biochemical</w:t>
+      </w:r>
+      <w:proofErr w:type="spellEnd"/>
+      <w:r>
+        <w:t xml:space="preserve"> </w:t>
+      </w:r>
+      <w:proofErr w:type="spellStart"/>
+      <w:r>
+        <w:t>Indicators</w:t>
+      </w:r>
+      <w:proofErr w:type="spellEnd"/>
+      <w:r>
+        <w:t xml:space="preserve"> of Stress for </w:t>
+      </w:r>
+      <w:proofErr w:type="spellStart"/>
+      <w:r>
+        <w:t>Connected</w:t>
+      </w:r>
+      <w:proofErr w:type="spellEnd"/>
+      <w:r>
+        <w:t xml:space="preserve"> and </w:t>
+      </w:r>
+      <w:proofErr w:type="spellStart"/>
+      <w:r>
+        <w:t>Preventive</w:t>
+      </w:r>
+      <w:proofErr w:type="spellEnd"/>
+      <w:r>
+        <w:t xml:space="preserve"> Healthcare », </w:t>
+      </w:r>
+      <w:r>
+        <w:rPr>
+          <w:i/>
+          <w:iCs/>
+        </w:rPr>
         <w:t>Diagnostics</w:t>
       </w:r>
       <w:r>
@@ -5238,7 +6817,20 @@
         <w:t>o</w:t>
       </w:r>
       <w:r>
-        <w:t xml:space="preserve"> 3, p. 556, mars 2021, doi: 10.3390/diagnostics11030556.</w:t>
+        <w:t xml:space="preserve"> 3, p. 556, mars 2021, </w:t>
+      </w:r>
+      <w:proofErr w:type="spellStart"/>
+      <w:proofErr w:type="gramStart"/>
+      <w:r>
+        <w:t>doi</w:t>
+      </w:r>
+      <w:proofErr w:type="spellEnd"/>
+      <w:r>
+        <w:t>:</w:t>
+      </w:r>
+      <w:proofErr w:type="gramEnd"/>
+      <w:r>
+        <w:t xml:space="preserve"> 10.3390/diagnostics11030556.</w:t>
       </w:r>
     </w:p>
     <w:p>
@@ -5262,37 +6854,217 @@
       </w:r>
       <w:r>
         <w:tab/>
-        <w:t xml:space="preserve">J. Á. Moreno-Gutiérrez, C. De Rojas Leal, M. V. López-González, A. Chao-Écija, et M. S. Dawid-Milner, « Impact of music performance anxiety on cardiovascular blood pressure responses, autonomic tone and baroreceptor sensitivity to a western classical music piano-concert », </w:t>
+        <w:t xml:space="preserve">J. Á. Moreno-Gutiérrez, C. De Rojas Leal, M. V. </w:t>
+      </w:r>
+      <w:proofErr w:type="spellStart"/>
+      <w:r>
+        <w:t>López</w:t>
+      </w:r>
+      <w:proofErr w:type="spellEnd"/>
+      <w:r>
+        <w:t xml:space="preserve">-González, A. Chao-Écija, et M. S. </w:t>
+      </w:r>
+      <w:proofErr w:type="spellStart"/>
+      <w:r>
+        <w:t>Dawid</w:t>
+      </w:r>
+      <w:proofErr w:type="spellEnd"/>
+      <w:r>
+        <w:t xml:space="preserve">-Milner, « Impact of music performance </w:t>
+      </w:r>
+      <w:proofErr w:type="spellStart"/>
+      <w:r>
+        <w:t>anxiety</w:t>
+      </w:r>
+      <w:proofErr w:type="spellEnd"/>
+      <w:r>
+        <w:t xml:space="preserve"> on </w:t>
+      </w:r>
+      <w:proofErr w:type="spellStart"/>
+      <w:r>
+        <w:t>cardiovascular</w:t>
+      </w:r>
+      <w:proofErr w:type="spellEnd"/>
+      <w:r>
+        <w:t xml:space="preserve"> </w:t>
+      </w:r>
+      <w:proofErr w:type="spellStart"/>
+      <w:r>
+        <w:t>blood</w:t>
+      </w:r>
+      <w:proofErr w:type="spellEnd"/>
+      <w:r>
+        <w:t xml:space="preserve"> pressure </w:t>
+      </w:r>
+      <w:proofErr w:type="spellStart"/>
+      <w:r>
+        <w:t>responses</w:t>
+      </w:r>
+      <w:proofErr w:type="spellEnd"/>
+      <w:r>
+        <w:t xml:space="preserve">, </w:t>
+      </w:r>
+      <w:proofErr w:type="spellStart"/>
+      <w:r>
+        <w:t>autonomic</w:t>
+      </w:r>
+      <w:proofErr w:type="spellEnd"/>
+      <w:r>
+        <w:t xml:space="preserve"> </w:t>
+      </w:r>
+      <w:proofErr w:type="spellStart"/>
+      <w:r>
+        <w:t>tone</w:t>
+      </w:r>
+      <w:proofErr w:type="spellEnd"/>
+      <w:r>
+        <w:t xml:space="preserve"> and </w:t>
+      </w:r>
+      <w:proofErr w:type="spellStart"/>
+      <w:r>
+        <w:t>baroreceptor</w:t>
+      </w:r>
+      <w:proofErr w:type="spellEnd"/>
+      <w:r>
+        <w:t xml:space="preserve"> </w:t>
+      </w:r>
+      <w:proofErr w:type="spellStart"/>
+      <w:r>
+        <w:t>sensitivity</w:t>
+      </w:r>
+      <w:proofErr w:type="spellEnd"/>
+      <w:r>
+        <w:t xml:space="preserve"> to a western </w:t>
+      </w:r>
+      <w:proofErr w:type="spellStart"/>
+      <w:r>
+        <w:t>classical</w:t>
+      </w:r>
+      <w:proofErr w:type="spellEnd"/>
+      <w:r>
+        <w:t xml:space="preserve"> music piano-concert », </w:t>
       </w:r>
       <w:r>
         <w:rPr>
           <w:i/>
           <w:iCs/>
         </w:rPr>
-        <w:t>Front. Neurosci.</w:t>
-      </w:r>
-      <w:r>
-        <w:t>, vol. 17, p. 1213117, juill. 2023, doi: 10.3389/fnins.2023.1213117.</w:t>
-      </w:r>
-    </w:p>
-    <w:p>
-      <w:pPr>
-        <w:pStyle w:val="Bibliographie"/>
-      </w:pPr>
-      <w:r>
-        <w:t>[13]</w:t>
-      </w:r>
-      <w:r>
-        <w:tab/>
-        <w:t xml:space="preserve">E. Volta et N. Di Stefano, « Using Wearable Sensors to Study Musical Experience: A Systematic Review », </w:t>
-      </w:r>
+        <w:t xml:space="preserve">Front. </w:t>
+      </w:r>
+      <w:proofErr w:type="spellStart"/>
       <w:r>
         <w:rPr>
           <w:i/>
           <w:iCs/>
         </w:rPr>
+        <w:t>Neurosci</w:t>
+      </w:r>
+      <w:proofErr w:type="spellEnd"/>
+      <w:r>
+        <w:rPr>
+          <w:i/>
+          <w:iCs/>
+        </w:rPr>
+        <w:t>.</w:t>
+      </w:r>
+      <w:r>
+        <w:t xml:space="preserve">, vol. 17, p. 1213117, juill. 2023, </w:t>
+      </w:r>
+      <w:proofErr w:type="spellStart"/>
+      <w:proofErr w:type="gramStart"/>
+      <w:r>
+        <w:t>doi</w:t>
+      </w:r>
+      <w:proofErr w:type="spellEnd"/>
+      <w:r>
+        <w:t>:</w:t>
+      </w:r>
+      <w:proofErr w:type="gramEnd"/>
+      <w:r>
+        <w:t xml:space="preserve"> 10.3389/fnins.2023.1213117.</w:t>
+      </w:r>
+    </w:p>
+    <w:p>
+      <w:pPr>
+        <w:pStyle w:val="Bibliographie"/>
+      </w:pPr>
+      <w:r>
+        <w:t>[13]</w:t>
+      </w:r>
+      <w:r>
+        <w:tab/>
+        <w:t>E. Volta et N. Di Stefano, « </w:t>
+      </w:r>
+      <w:proofErr w:type="spellStart"/>
+      <w:r>
+        <w:t>Using</w:t>
+      </w:r>
+      <w:proofErr w:type="spellEnd"/>
+      <w:r>
+        <w:t xml:space="preserve"> </w:t>
+      </w:r>
+      <w:proofErr w:type="spellStart"/>
+      <w:r>
+        <w:t>Wearable</w:t>
+      </w:r>
+      <w:proofErr w:type="spellEnd"/>
+      <w:r>
+        <w:t xml:space="preserve"> </w:t>
+      </w:r>
+      <w:proofErr w:type="spellStart"/>
+      <w:r>
         <w:t>Sensors</w:t>
       </w:r>
+      <w:proofErr w:type="spellEnd"/>
+      <w:r>
+        <w:t xml:space="preserve"> to </w:t>
+      </w:r>
+      <w:proofErr w:type="spellStart"/>
+      <w:r>
+        <w:t>Study</w:t>
+      </w:r>
+      <w:proofErr w:type="spellEnd"/>
+      <w:r>
+        <w:t xml:space="preserve"> Musical </w:t>
+      </w:r>
+      <w:proofErr w:type="spellStart"/>
+      <w:proofErr w:type="gramStart"/>
+      <w:r>
+        <w:t>Experience</w:t>
+      </w:r>
+      <w:proofErr w:type="spellEnd"/>
+      <w:r>
+        <w:t>:</w:t>
+      </w:r>
+      <w:proofErr w:type="gramEnd"/>
+      <w:r>
+        <w:t xml:space="preserve"> A </w:t>
+      </w:r>
+      <w:proofErr w:type="spellStart"/>
+      <w:r>
+        <w:t>Systematic</w:t>
+      </w:r>
+      <w:proofErr w:type="spellEnd"/>
+      <w:r>
+        <w:t xml:space="preserve"> </w:t>
+      </w:r>
+      <w:proofErr w:type="spellStart"/>
+      <w:r>
+        <w:t>Review</w:t>
+      </w:r>
+      <w:proofErr w:type="spellEnd"/>
+      <w:r>
+        <w:t xml:space="preserve"> », </w:t>
+      </w:r>
+      <w:proofErr w:type="spellStart"/>
+      <w:r>
+        <w:rPr>
+          <w:i/>
+          <w:iCs/>
+        </w:rPr>
+        <w:t>Sensors</w:t>
+      </w:r>
+      <w:proofErr w:type="spellEnd"/>
       <w:r>
         <w:t>, vol. 24, n</w:t>
       </w:r>
@@ -5303,7 +7075,15 @@
         <w:t>o</w:t>
       </w:r>
       <w:r>
-        <w:t xml:space="preserve"> 17, p. 5783, sept. 2024, doi: 10.3390/s24175783.</w:t>
+        <w:t xml:space="preserve"> 17, p. 5783, sept. 2024, </w:t>
+      </w:r>
+      <w:proofErr w:type="spellStart"/>
+      <w:r>
+        <w:t>doi</w:t>
+      </w:r>
+      <w:proofErr w:type="spellEnd"/>
+      <w:r>
+        <w:t>: 10.3390/s24175783.</w:t>
       </w:r>
     </w:p>
     <w:p>
@@ -5311,7 +7091,6 @@
         <w:pStyle w:val="Bibliographie"/>
       </w:pPr>
       <w:r>
-        <w:lastRenderedPageBreak/>
         <w:t>[14]</w:t>
       </w:r>
       <w:r>
@@ -5326,48 +7105,96 @@
         <w:t>et al.</w:t>
       </w:r>
       <w:r>
-        <w:t xml:space="preserve">, « Expressivity attributed to music affects the smoothness of bowing movements in violinists », </w:t>
-      </w:r>
+        <w:t>, « </w:t>
+      </w:r>
+      <w:proofErr w:type="spellStart"/>
+      <w:r>
+        <w:t>Expressivity</w:t>
+      </w:r>
+      <w:proofErr w:type="spellEnd"/>
+      <w:r>
+        <w:t xml:space="preserve"> </w:t>
+      </w:r>
+      <w:proofErr w:type="spellStart"/>
+      <w:r>
+        <w:t>attributed</w:t>
+      </w:r>
+      <w:proofErr w:type="spellEnd"/>
+      <w:r>
+        <w:t xml:space="preserve"> to music affects the </w:t>
+      </w:r>
+      <w:proofErr w:type="spellStart"/>
+      <w:r>
+        <w:t>smoothness</w:t>
+      </w:r>
+      <w:proofErr w:type="spellEnd"/>
+      <w:r>
+        <w:t xml:space="preserve"> of </w:t>
+      </w:r>
+      <w:proofErr w:type="spellStart"/>
+      <w:r>
+        <w:t>bowing</w:t>
+      </w:r>
+      <w:proofErr w:type="spellEnd"/>
+      <w:r>
+        <w:t xml:space="preserve"> </w:t>
+      </w:r>
+      <w:proofErr w:type="spellStart"/>
+      <w:r>
+        <w:t>movements</w:t>
+      </w:r>
+      <w:proofErr w:type="spellEnd"/>
+      <w:r>
+        <w:t xml:space="preserve"> in </w:t>
+      </w:r>
+      <w:proofErr w:type="spellStart"/>
+      <w:r>
+        <w:t>violinists</w:t>
+      </w:r>
+      <w:proofErr w:type="spellEnd"/>
+      <w:r>
+        <w:t xml:space="preserve"> », </w:t>
+      </w:r>
+      <w:proofErr w:type="spellStart"/>
       <w:r>
         <w:rPr>
           <w:i/>
           <w:iCs/>
         </w:rPr>
-        <w:t>Sci. Rep.</w:t>
-      </w:r>
-      <w:r>
-        <w:t>, vol. 14, n</w:t>
-      </w:r>
-      <w:r>
-        <w:rPr>
-          <w:vertAlign w:val="superscript"/>
-        </w:rPr>
-        <w:t>o</w:t>
-      </w:r>
-      <w:r>
-        <w:t xml:space="preserve"> 1, p. 22267, sept. 2024, doi: 10.1038/s41598-024-73593-4.</w:t>
-      </w:r>
-    </w:p>
-    <w:p>
-      <w:pPr>
-        <w:pStyle w:val="Bibliographie"/>
-      </w:pPr>
-      <w:r>
-        <w:t>[15]</w:t>
-      </w:r>
-      <w:r>
-        <w:tab/>
-        <w:t xml:space="preserve">M. Diarra, J. Theurel, et B. Paty, « Systematic review of neurophysiological assessment techniques and metrics for mental workload evaluation in real-world settings », </w:t>
-      </w:r>
+        <w:t>Sci</w:t>
+      </w:r>
+      <w:proofErr w:type="spellEnd"/>
       <w:r>
         <w:rPr>
           <w:i/>
           <w:iCs/>
         </w:rPr>
-        <w:t>Front. Neuroergonomics</w:t>
-      </w:r>
-      <w:r>
-        <w:t>, vol. 6, p. 1584736, avr. 2025, doi: 10.3389/fnrgo.2025.1584736.</w:t>
+        <w:t>. Rep.</w:t>
+      </w:r>
+      <w:r>
+        <w:t>, vol. 14, n</w:t>
+      </w:r>
+      <w:r>
+        <w:rPr>
+          <w:vertAlign w:val="superscript"/>
+        </w:rPr>
+        <w:t>o</w:t>
+      </w:r>
+      <w:r>
+        <w:t xml:space="preserve"> 1, p. 22267, sept. 2024, </w:t>
+      </w:r>
+      <w:proofErr w:type="spellStart"/>
+      <w:proofErr w:type="gramStart"/>
+      <w:r>
+        <w:t>doi</w:t>
+      </w:r>
+      <w:proofErr w:type="spellEnd"/>
+      <w:r>
+        <w:t>:</w:t>
+      </w:r>
+      <w:proofErr w:type="gramEnd"/>
+      <w:r>
+        <w:t xml:space="preserve"> 10.1038/s41598-024-73593-4.</w:t>
       </w:r>
     </w:p>
     <w:p>
@@ -5375,18 +7202,206 @@
         <w:pStyle w:val="Bibliographie"/>
       </w:pPr>
       <w:r>
-        <w:t>[16]</w:t>
+        <w:t>[15]</w:t>
       </w:r>
       <w:r>
         <w:tab/>
-        <w:t xml:space="preserve">S. Setyorini, I. A. Elbaith Zaeni, et H. Elmunsyah, « A Hybrid Machine Learning Approach Utilizing PCA and ICA Features for Stress Classification », </w:t>
+        <w:t xml:space="preserve">M. Diarra, J. </w:t>
+      </w:r>
+      <w:proofErr w:type="spellStart"/>
+      <w:r>
+        <w:t>Theurel</w:t>
+      </w:r>
+      <w:proofErr w:type="spellEnd"/>
+      <w:r>
+        <w:t>, et B. Paty, « </w:t>
+      </w:r>
+      <w:proofErr w:type="spellStart"/>
+      <w:r>
+        <w:t>Systematic</w:t>
+      </w:r>
+      <w:proofErr w:type="spellEnd"/>
+      <w:r>
+        <w:t xml:space="preserve"> </w:t>
+      </w:r>
+      <w:proofErr w:type="spellStart"/>
+      <w:r>
+        <w:t>review</w:t>
+      </w:r>
+      <w:proofErr w:type="spellEnd"/>
+      <w:r>
+        <w:t xml:space="preserve"> of </w:t>
+      </w:r>
+      <w:proofErr w:type="spellStart"/>
+      <w:r>
+        <w:t>neurophysiological</w:t>
+      </w:r>
+      <w:proofErr w:type="spellEnd"/>
+      <w:r>
+        <w:t xml:space="preserve"> </w:t>
+      </w:r>
+      <w:proofErr w:type="spellStart"/>
+      <w:r>
+        <w:t>assessment</w:t>
+      </w:r>
+      <w:proofErr w:type="spellEnd"/>
+      <w:r>
+        <w:t xml:space="preserve"> techniques and </w:t>
+      </w:r>
+      <w:proofErr w:type="spellStart"/>
+      <w:r>
+        <w:t>metrics</w:t>
+      </w:r>
+      <w:proofErr w:type="spellEnd"/>
+      <w:r>
+        <w:t xml:space="preserve"> for mental </w:t>
+      </w:r>
+      <w:proofErr w:type="spellStart"/>
+      <w:r>
+        <w:t>workload</w:t>
+      </w:r>
+      <w:proofErr w:type="spellEnd"/>
+      <w:r>
+        <w:t xml:space="preserve"> </w:t>
+      </w:r>
+      <w:proofErr w:type="spellStart"/>
+      <w:r>
+        <w:t>evaluation</w:t>
+      </w:r>
+      <w:proofErr w:type="spellEnd"/>
+      <w:r>
+        <w:t xml:space="preserve"> in real-world settings », </w:t>
       </w:r>
       <w:r>
         <w:rPr>
           <w:i/>
           <w:iCs/>
         </w:rPr>
-        <w:t>JOIV Int. J. Inform. Vis.</w:t>
+        <w:t xml:space="preserve">Front. </w:t>
+      </w:r>
+      <w:proofErr w:type="spellStart"/>
+      <w:r>
+        <w:rPr>
+          <w:i/>
+          <w:iCs/>
+        </w:rPr>
+        <w:t>Neuroergonomics</w:t>
+      </w:r>
+      <w:proofErr w:type="spellEnd"/>
+      <w:r>
+        <w:t xml:space="preserve">, vol. 6, p. 1584736, avr. 2025, </w:t>
+      </w:r>
+      <w:proofErr w:type="spellStart"/>
+      <w:proofErr w:type="gramStart"/>
+      <w:r>
+        <w:t>doi</w:t>
+      </w:r>
+      <w:proofErr w:type="spellEnd"/>
+      <w:r>
+        <w:t>:</w:t>
+      </w:r>
+      <w:proofErr w:type="gramEnd"/>
+      <w:r>
+        <w:t xml:space="preserve"> 10.3389/fnrgo.2025.1584736.</w:t>
+      </w:r>
+    </w:p>
+    <w:p>
+      <w:pPr>
+        <w:pStyle w:val="Bibliographie"/>
+      </w:pPr>
+      <w:r>
+        <w:t>[16]</w:t>
+      </w:r>
+      <w:r>
+        <w:tab/>
+        <w:t xml:space="preserve">S. </w:t>
+      </w:r>
+      <w:proofErr w:type="spellStart"/>
+      <w:r>
+        <w:t>Setyorini</w:t>
+      </w:r>
+      <w:proofErr w:type="spellEnd"/>
+      <w:r>
+        <w:t xml:space="preserve">, I. A. </w:t>
+      </w:r>
+      <w:proofErr w:type="spellStart"/>
+      <w:r>
+        <w:t>Elbaith</w:t>
+      </w:r>
+      <w:proofErr w:type="spellEnd"/>
+      <w:r>
+        <w:t xml:space="preserve"> </w:t>
+      </w:r>
+      <w:proofErr w:type="spellStart"/>
+      <w:r>
+        <w:t>Zaeni</w:t>
+      </w:r>
+      <w:proofErr w:type="spellEnd"/>
+      <w:r>
+        <w:t xml:space="preserve">, et H. </w:t>
+      </w:r>
+      <w:proofErr w:type="spellStart"/>
+      <w:r>
+        <w:t>Elmunsyah</w:t>
+      </w:r>
+      <w:proofErr w:type="spellEnd"/>
+      <w:r>
+        <w:t xml:space="preserve">, « A </w:t>
+      </w:r>
+      <w:proofErr w:type="spellStart"/>
+      <w:r>
+        <w:t>Hybrid</w:t>
+      </w:r>
+      <w:proofErr w:type="spellEnd"/>
+      <w:r>
+        <w:t xml:space="preserve"> Machine Learning </w:t>
+      </w:r>
+      <w:proofErr w:type="spellStart"/>
+      <w:r>
+        <w:t>Approach</w:t>
+      </w:r>
+      <w:proofErr w:type="spellEnd"/>
+      <w:r>
+        <w:t xml:space="preserve"> </w:t>
+      </w:r>
+      <w:proofErr w:type="spellStart"/>
+      <w:r>
+        <w:t>Utilizing</w:t>
+      </w:r>
+      <w:proofErr w:type="spellEnd"/>
+      <w:r>
+        <w:t xml:space="preserve"> PCA and ICA </w:t>
+      </w:r>
+      <w:proofErr w:type="spellStart"/>
+      <w:r>
+        <w:t>Features</w:t>
+      </w:r>
+      <w:proofErr w:type="spellEnd"/>
+      <w:r>
+        <w:t xml:space="preserve"> for Stress Classification », </w:t>
+      </w:r>
+      <w:r>
+        <w:rPr>
+          <w:i/>
+          <w:iCs/>
+        </w:rPr>
+        <w:t xml:space="preserve">JOIV Int. J. </w:t>
+      </w:r>
+      <w:proofErr w:type="spellStart"/>
+      <w:r>
+        <w:rPr>
+          <w:i/>
+          <w:iCs/>
+        </w:rPr>
+        <w:t>Inform</w:t>
+      </w:r>
+      <w:proofErr w:type="spellEnd"/>
+      <w:r>
+        <w:rPr>
+          <w:i/>
+          <w:iCs/>
+        </w:rPr>
+        <w:t>. Vis.</w:t>
       </w:r>
       <w:r>
         <w:t>, vol. 9, n</w:t>
@@ -5398,7 +7413,336 @@
         <w:t>o</w:t>
       </w:r>
       <w:r>
-        <w:t xml:space="preserve"> 3, p. 1226, mai 2025, doi: 10.62527/joiv.9.3.3378.</w:t>
+        <w:t xml:space="preserve"> 3, p. 1226, mai 2025, </w:t>
+      </w:r>
+      <w:proofErr w:type="spellStart"/>
+      <w:proofErr w:type="gramStart"/>
+      <w:r>
+        <w:t>doi</w:t>
+      </w:r>
+      <w:proofErr w:type="spellEnd"/>
+      <w:r>
+        <w:t>:</w:t>
+      </w:r>
+      <w:proofErr w:type="gramEnd"/>
+      <w:r>
+        <w:t xml:space="preserve"> 10.62527/joiv.9.3.3378.</w:t>
+      </w:r>
+    </w:p>
+    <w:p>
+      <w:pPr>
+        <w:pStyle w:val="Bibliographie"/>
+      </w:pPr>
+      <w:r>
+        <w:t>[17]</w:t>
+      </w:r>
+      <w:r>
+        <w:tab/>
+        <w:t xml:space="preserve">A. </w:t>
+      </w:r>
+      <w:proofErr w:type="spellStart"/>
+      <w:r>
+        <w:t>Williamon</w:t>
+      </w:r>
+      <w:proofErr w:type="spellEnd"/>
+      <w:r>
+        <w:t xml:space="preserve"> et S. Thompson, « </w:t>
+      </w:r>
+      <w:proofErr w:type="spellStart"/>
+      <w:r>
+        <w:t>Awareness</w:t>
+      </w:r>
+      <w:proofErr w:type="spellEnd"/>
+      <w:r>
+        <w:t xml:space="preserve"> and incidence of </w:t>
+      </w:r>
+      <w:proofErr w:type="spellStart"/>
+      <w:r>
+        <w:t>health</w:t>
+      </w:r>
+      <w:proofErr w:type="spellEnd"/>
+      <w:r>
+        <w:t xml:space="preserve"> </w:t>
+      </w:r>
+      <w:proofErr w:type="spellStart"/>
+      <w:r>
+        <w:t>problems</w:t>
+      </w:r>
+      <w:proofErr w:type="spellEnd"/>
+      <w:r>
+        <w:t xml:space="preserve"> </w:t>
+      </w:r>
+      <w:proofErr w:type="spellStart"/>
+      <w:r>
+        <w:t>among</w:t>
+      </w:r>
+      <w:proofErr w:type="spellEnd"/>
+      <w:r>
+        <w:t xml:space="preserve"> conservatoire </w:t>
+      </w:r>
+      <w:proofErr w:type="spellStart"/>
+      <w:r>
+        <w:t>students</w:t>
+      </w:r>
+      <w:proofErr w:type="spellEnd"/>
+      <w:r>
+        <w:t xml:space="preserve"> », </w:t>
+      </w:r>
+      <w:proofErr w:type="spellStart"/>
+      <w:r>
+        <w:rPr>
+          <w:i/>
+          <w:iCs/>
+        </w:rPr>
+        <w:t>Psychol</w:t>
+      </w:r>
+      <w:proofErr w:type="spellEnd"/>
+      <w:r>
+        <w:rPr>
+          <w:i/>
+          <w:iCs/>
+        </w:rPr>
+        <w:t>. Music</w:t>
+      </w:r>
+      <w:r>
+        <w:t>, vol. 34, n</w:t>
+      </w:r>
+      <w:r>
+        <w:rPr>
+          <w:vertAlign w:val="superscript"/>
+        </w:rPr>
+        <w:t>o</w:t>
+      </w:r>
+      <w:r>
+        <w:t xml:space="preserve"> 4, p. 411</w:t>
+      </w:r>
+      <w:r>
+        <w:rPr>
+          <w:rFonts w:ascii="Cambria Math" w:hAnsi="Cambria Math" w:cs="Cambria Math"/>
+        </w:rPr>
+        <w:t>‑</w:t>
+      </w:r>
+      <w:r>
+        <w:t xml:space="preserve">430, oct. 2006, </w:t>
+      </w:r>
+      <w:proofErr w:type="spellStart"/>
+      <w:proofErr w:type="gramStart"/>
+      <w:r>
+        <w:t>doi</w:t>
+      </w:r>
+      <w:proofErr w:type="spellEnd"/>
+      <w:r>
+        <w:t>:</w:t>
+      </w:r>
+      <w:proofErr w:type="gramEnd"/>
+      <w:r>
+        <w:t xml:space="preserve"> 10.1177/0305735606067150.</w:t>
+      </w:r>
+    </w:p>
+    <w:p>
+      <w:pPr>
+        <w:pStyle w:val="Bibliographie"/>
+      </w:pPr>
+      <w:r>
+        <w:t>[18]</w:t>
+      </w:r>
+      <w:r>
+        <w:tab/>
+        <w:t xml:space="preserve">D. T. Kenny, « The Kenny music performance </w:t>
+      </w:r>
+      <w:proofErr w:type="spellStart"/>
+      <w:r>
+        <w:t>anxiety</w:t>
+      </w:r>
+      <w:proofErr w:type="spellEnd"/>
+      <w:r>
+        <w:t xml:space="preserve"> </w:t>
+      </w:r>
+      <w:proofErr w:type="spellStart"/>
+      <w:r>
+        <w:t>inventory</w:t>
+      </w:r>
+      <w:proofErr w:type="spellEnd"/>
+      <w:r>
+        <w:t xml:space="preserve"> (K-MPAI</w:t>
+      </w:r>
+      <w:proofErr w:type="gramStart"/>
+      <w:r>
+        <w:t>):</w:t>
+      </w:r>
+      <w:proofErr w:type="gramEnd"/>
+      <w:r>
+        <w:t xml:space="preserve"> </w:t>
+      </w:r>
+      <w:proofErr w:type="spellStart"/>
+      <w:r>
+        <w:t>Scale</w:t>
+      </w:r>
+      <w:proofErr w:type="spellEnd"/>
+      <w:r>
+        <w:t xml:space="preserve"> construction, cross-cultural validation, </w:t>
+      </w:r>
+      <w:proofErr w:type="spellStart"/>
+      <w:r>
+        <w:t>theoretical</w:t>
+      </w:r>
+      <w:proofErr w:type="spellEnd"/>
+      <w:r>
+        <w:t xml:space="preserve"> </w:t>
+      </w:r>
+      <w:proofErr w:type="spellStart"/>
+      <w:r>
+        <w:t>underpinnings</w:t>
+      </w:r>
+      <w:proofErr w:type="spellEnd"/>
+      <w:r>
+        <w:t xml:space="preserve">, and diagnostic and </w:t>
+      </w:r>
+      <w:proofErr w:type="spellStart"/>
+      <w:r>
+        <w:t>therapeutic</w:t>
+      </w:r>
+      <w:proofErr w:type="spellEnd"/>
+      <w:r>
+        <w:t xml:space="preserve"> utility », </w:t>
+      </w:r>
+      <w:r>
+        <w:rPr>
+          <w:i/>
+          <w:iCs/>
+        </w:rPr>
+        <w:t xml:space="preserve">Front. </w:t>
+      </w:r>
+      <w:proofErr w:type="spellStart"/>
+      <w:r>
+        <w:rPr>
+          <w:i/>
+          <w:iCs/>
+        </w:rPr>
+        <w:t>Psychol</w:t>
+      </w:r>
+      <w:proofErr w:type="spellEnd"/>
+      <w:r>
+        <w:rPr>
+          <w:i/>
+          <w:iCs/>
+        </w:rPr>
+        <w:t>.</w:t>
+      </w:r>
+      <w:r>
+        <w:t xml:space="preserve">, vol. 14, p. 1143359, mai 2023, </w:t>
+      </w:r>
+      <w:proofErr w:type="spellStart"/>
+      <w:proofErr w:type="gramStart"/>
+      <w:r>
+        <w:t>doi</w:t>
+      </w:r>
+      <w:proofErr w:type="spellEnd"/>
+      <w:r>
+        <w:t>:</w:t>
+      </w:r>
+      <w:proofErr w:type="gramEnd"/>
+      <w:r>
+        <w:t xml:space="preserve"> 10.3389/fpsyg.2023.1143359.</w:t>
+      </w:r>
+    </w:p>
+    <w:p>
+      <w:pPr>
+        <w:pStyle w:val="Bibliographie"/>
+      </w:pPr>
+      <w:r>
+        <w:t>[19]</w:t>
+      </w:r>
+      <w:r>
+        <w:tab/>
+        <w:t xml:space="preserve">A. J. </w:t>
+      </w:r>
+      <w:proofErr w:type="spellStart"/>
+      <w:r>
+        <w:t>Twitchell</w:t>
+      </w:r>
+      <w:proofErr w:type="spellEnd"/>
+      <w:r>
+        <w:t xml:space="preserve">, A.-A. </w:t>
+      </w:r>
+      <w:proofErr w:type="spellStart"/>
+      <w:r>
+        <w:t>Journault</w:t>
+      </w:r>
+      <w:proofErr w:type="spellEnd"/>
+      <w:r>
+        <w:t xml:space="preserve">, K. K. Singh, et J. P. Jamieson, « A </w:t>
+      </w:r>
+      <w:proofErr w:type="spellStart"/>
+      <w:r>
+        <w:t>review</w:t>
+      </w:r>
+      <w:proofErr w:type="spellEnd"/>
+      <w:r>
+        <w:t xml:space="preserve"> of music performance </w:t>
+      </w:r>
+      <w:proofErr w:type="spellStart"/>
+      <w:r>
+        <w:t>anxiety</w:t>
+      </w:r>
+      <w:proofErr w:type="spellEnd"/>
+      <w:r>
+        <w:t xml:space="preserve"> in the </w:t>
+      </w:r>
+      <w:proofErr w:type="spellStart"/>
+      <w:r>
+        <w:t>lens</w:t>
+      </w:r>
+      <w:proofErr w:type="spellEnd"/>
+      <w:r>
+        <w:t xml:space="preserve"> of stress </w:t>
+      </w:r>
+      <w:proofErr w:type="spellStart"/>
+      <w:r>
+        <w:t>models</w:t>
+      </w:r>
+      <w:proofErr w:type="spellEnd"/>
+      <w:r>
+        <w:t xml:space="preserve"> », </w:t>
+      </w:r>
+      <w:r>
+        <w:rPr>
+          <w:i/>
+          <w:iCs/>
+        </w:rPr>
+        <w:t xml:space="preserve">Front. </w:t>
+      </w:r>
+      <w:proofErr w:type="spellStart"/>
+      <w:r>
+        <w:rPr>
+          <w:i/>
+          <w:iCs/>
+        </w:rPr>
+        <w:t>Psychol</w:t>
+      </w:r>
+      <w:proofErr w:type="spellEnd"/>
+      <w:r>
+        <w:rPr>
+          <w:i/>
+          <w:iCs/>
+        </w:rPr>
+        <w:t>.</w:t>
+      </w:r>
+      <w:r>
+        <w:t xml:space="preserve">, vol. 16, p. 1576391, avr. 2025, </w:t>
+      </w:r>
+      <w:proofErr w:type="spellStart"/>
+      <w:proofErr w:type="gramStart"/>
+      <w:r>
+        <w:t>doi</w:t>
+      </w:r>
+      <w:proofErr w:type="spellEnd"/>
+      <w:r>
+        <w:t>:</w:t>
+      </w:r>
+      <w:proofErr w:type="gramEnd"/>
+      <w:r>
+        <w:t xml:space="preserve"> 10.3389/fpsyg.2025.1576391.</w:t>
       </w:r>
     </w:p>
     <w:p>
@@ -6290,7 +8634,6 @@
   <w:style w:type="character" w:default="1" w:styleId="Policepardfaut">
     <w:name w:val="Default Paragraph Font"/>
     <w:uiPriority w:val="1"/>
-    <w:semiHidden/>
     <w:unhideWhenUsed/>
   </w:style>
   <w:style w:type="table" w:default="1" w:styleId="TableauNormal">
@@ -6737,7 +9080,7 @@
 </file>
 
 <file path=customXml/itemProps1.xml><?xml version="1.0" encoding="utf-8"?>
-<ds:datastoreItem xmlns:ds="http://schemas.openxmlformats.org/officeDocument/2006/customXml" ds:itemID="{28603AD4-C6CE-4BF7-8EEB-98A14FBF4472}">
+<ds:datastoreItem xmlns:ds="http://schemas.openxmlformats.org/officeDocument/2006/customXml" ds:itemID="{33BCBF2A-A805-490B-891D-5917777FA350}">
   <ds:schemaRefs>
     <ds:schemaRef ds:uri="http://schemas.openxmlformats.org/officeDocument/2006/bibliography"/>
   </ds:schemaRefs>

</xml_diff>